<commit_message>
Revise the 2209-A proposal after the review and the 2026 call check.
Replace parenthetical table and section references, define terms at first use, align the FrugalGPT claims with the cited version, and add access dates and the updated generative AI declaration.

Co-authored-by: Cursor <cursoragent@cursor.com>
</commit_message>
<xml_diff>
--- a/docs/2209-A_Arastirma_Onerisi.docx
+++ b/docs/2209-A_Arastirma_Onerisi.docx
@@ -203,7 +203,7 @@
                 <ns0:szCs ns0:val="18"/>
                 <ns0:color ns0:val="000000"/>
               </ns0:rPr>
-              <ns0:t xml:space="preserve">Araştırma Önerisinin Başlığı: Büyük Dil Modeli Destekli Oyuncu Olmayan Karakter (NPC) Eylemlerinin Oyun Kurallarına Göre Doğrulanması</ns0:t>
+              <ns0:t>Araştırma Önerisinin Başlığı: Büyük Dil Modeli Destekli Oyuncu Olmayan Karakter (Non-Player Character, NPC) Eylemlerinin Oyun Kurallarına Göre Doğrulanması</ns0:t>
             </ns0:r>
           </ns0:p>
         </ns0:tc>
@@ -523,7 +523,7 @@
                 <ns0:sz ns0:val="18"/>
                 <ns0:szCs ns0:val="18"/>
               </ns0:rPr>
-              <ns0:t xml:space="preserve">Dijital oyunlarda oyuncu olmayan karakterlerin (NPC) cümleleri çoğunlukla önceden yazıldığı için oyuncunun beklenmedik tercihleri aynı hazır yanıtla karşılanır. Büyük dil modelleri bu sınırı yeni cümleler üreterek aşabilir; ancak üretilen cümle envanterde olmayan bir eşyayı varmış gibi gösterebilir, kapanmış bir görevi yeniden açabilir veya sahnede bulunmayan bir karaktere eylem yöneltebilir. Bu projede dil modeli karar veren değil öneri üreten bir bileşendir ve öneri oyun durumuna yazılmadan önce şema, izin ve ön koşul denetimi yapan bir doğrulama katmanından geçer. Şema ve izin denetimi yapısal hataları yakalar, fakat diyalogun envanterle çelişmesi gibi anlamsal tutarsızlıklar eylem alanı geçerli olduğu için bu denetimden geçebilir. Bu nedenle ana araştırma sorusu, yapısal doğrulamanın anlamsal tutarsızlıkların ne kadarını oyun durumuna ulaşmadan yakalayabildiğidir. Soru; doğal koşullarda doğrulayıcısız geçersiz eylem oranını, anlamsal tutarlılığı ve kısa bağlamın token tasarrufu ile tutarlılık arasındaki ödünleşimini ölçen üç hipotezle (H1–H3), ayrıca kare süresine ilişkin bir fark ölçütüyle (H4) sınanır.</ns0:t>
+              <ns0:t>Dijital oyunlarda oyuncu olmayan karakterlerin (non-player character, NPC) cümleleri çoğunlukla önceden yazıldığı için oyuncunun beklenmedik tercihleri aynı hazır yanıtla karşılanır. Büyük dil modelleri (large language model, LLM) bu sınırı yeni cümleler üreterek aşabilir; ancak üretilen cümle envanterde olmayan bir eşyayı varmış gibi gösterebilir, kapanmış bir görevi yeniden açabilir veya sahnede bulunmayan bir karaktere eylem yöneltebilir. Bu projede dil modeli karar veren değil öneri üreten bir bileşendir ve öneri oyun durumuna yazılmadan önce şema, izin ve ön koşul denetimi yapan bir doğrulama katmanından geçer. Şema ve izin denetimi yapısal hataları yakalar, fakat diyalogun envanterle çelişmesi gibi anlamsal tutarsızlıklar eylem alanı geçerli olduğu için bu denetimden geçebilir. Bu nedenle ana araştırma sorusu, yapısal doğrulamanın anlamsal tutarsızlıkların ne kadarını oyun durumuna ulaşmadan yakalayabildiğidir. Soru dört hipotezle sınanır: H1 kısa bağlamın token (modelin işlediği metin parçası) tasarrufu ile tutarlılık arasındaki ödünleşimi, H2 doğrulama katmanı olmadan çalışan sistemin doğal koşullarda önerdiği geçersiz eylem oranını, H3 anlamsal tutarlılığı ölçer; H4 ise isteğin oyunun akıcılığını bozup bozmadığına, yani kare süresinin (bir görüntü karesinin çizilme süresi) istek sırasındaki artış oranına bakar.</ns0:t>
             </ns0:r>
           </ns0:p>
           <ns0:p>
@@ -540,7 +540,7 @@
                 <ns0:sz ns0:val="18"/>
                 <ns0:szCs ns0:val="18"/>
               </ns0:rPr>
-              <ns0:t xml:space="preserve">Yöntem, tekrarlı ölçümlü bir karşılaştırmadır. Aynı köy senaryosu üç koşulda çalıştırılır: sabit diyalog (C0), yalnız dil modeli (C1) ve dil modeli ile doğrulama ve önbellek birlikte (C2). C1 ve C2, barındırılan bir ticari modelde ve ayrı bir sunucuda çalışan açık ağırlıklı ikinci bir modelde koşulduğu için sonuçlar tek bir modele bağlı kalmaz ve uygulama programlama arayüzü (API) kesintisi riski küçülür. Beş kabul senaryosu bozuk yanıt, izinsiz eylem ve zaman aşımını da kapsar. Her deney hücresinde 30 tamamlanmış koşu bulunur ve 10 koşuluk bir pilot, hipotez eşiklerini doğrulayıcı koşular başlamadan günlüğe kilitler. Tutarlılık 1–5 arası öznel bir puanla değil, yedi maddelik bir kontrol listesinin sayımıyla ölçülür. Gecikme ve kare süresi çarpık dağıldığı için medyan ile yüzde 95’lik dilim (p95) raporlanır; eşleştirilmiş karşılaştırmalarda Wilcoxon işaretli sıra testi ve Holm düzeltmesi kullanılır.</ns0:t>
+              <ns0:t xml:space="preserve">Yöntem, tekrarlı ölçümlü bir karşılaştırmadır. Aynı köy senaryosu üç koşulda çalıştırılır: sabit diyalog (C0), yalnız dil modeli (C1) ve dil modeli ile doğrulama ve önbellek (daha önce alınan yanıtın saklanıp yeniden kullanılması) birlikte (C2). C1 ve C2, barındırılan bir ticari modelde ve ayrı bir sunucuda çalışan açık ağırlıklı ikinci bir modelde koşulduğu için sonuçlar tek bir modele bağlı kalmaz ve uygulama programlama arayüzü (API) kesintisi riski küçülür. Beş kabul senaryosu bozuk yanıt, izinsiz eylem ve zaman aşımını da kapsar. Her deney hücresinde (koşul, model ve yapılandırmanın her bir birleşimi) 30 tamamlanmış koşu bulunur ve 10 koşuluk bir pilot, hipotez eşiklerini doğrulayıcı koşular başlamadan günlüğe kilitler. Tutarlılık 1–5 arası öznel bir puanla değil, yedi maddelik bir kontrol listesinin sayımıyla ölçülür. Gecikme ve kare süresi çarpık dağıldığı için medyan ile yüzde 95’lik dilim (p95) raporlanır; eşleştirilmiş karşılaştırmalarda Wilcoxon işaretli sıra testi ve Holm düzeltmesi kullanılır.</ns0:t>
             </ns0:r>
           </ns0:p>
           <ns0:p>
@@ -557,7 +557,7 @@
                 <ns0:sz ns0:val="18"/>
                 <ns0:szCs ns0:val="18"/>
               </ns0:rPr>
-              <ns0:t>Proje tek yürütücüyle ve 12 ayda (1 Şubat 2027 – 31 Ocak 2028) dört iş paketinde (İP1–İP4) yürütülür: doğrulayıcı ve kabul testleri, uçtan uca konuşan dikey dilim, önbellek ile bağlam bütçesinin iki modelle telemetriye bağlanması ve koşuların çözümlenmesi. Ekim 2026’da Unity 6000.6 ve Evrensel Render Hattı (URP) ile kurulan prototipte olay, beyin, istemci, doğrulama ve yürütücü sözleşmeleri derlenmiştir; somut sınıflar ve ölçümler destek döneminde üretilecektir. Başlıca riskler API kesintisi, ikinci modelin grafik işlem birimli (GPU) sunucusunun erişilemez veya yavaş kalması, doğrulayıcının geçerli görevi de reddetmesi ve anlamsal kontrollerin elle etiketleme gerektirmesidir; B planları doğrulama katmanını ve ölçütleri yerinde bırakır.</ns0:t>
+              <ns0:t>Proje tek yürütücüyle, 12 ayda ve dört iş paketinde yürütülür. Ekim 2026’da kurulan prototipte sözleşmeler derlenmiş, somut sınıflar ile ölçüm destek dönemine bırakılmıştır. Başlıca riskler API kesintisi, ikinci modelin grafik işlem birimli (GPU) sunucusunun erişilememesi, doğrulayıcının geçerli görevi reddetmesi ve anlamsal kontrollerin elle etiketleme gerektirmesidir.</ns0:t>
             </ns0:r>
           </ns0:p>
           <ns0:p>
@@ -574,7 +574,7 @@
                 <ns0:sz ns0:val="18"/>
                 <ns0:szCs ns0:val="18"/>
               </ns0:rPr>
-              <ns0:t xml:space="preserve">Beklenen çıktılar; bitirme tezinin deney bölümü, Uluslararası Bilgisayar Bilimleri ve Mühendisliği Konferansı (UBMK) veya Akademik Bilişim Konferansı’na gönderilecek bir bildiri, doğrulayıcı bileşenin ve köy sahnesinin GitHub’da açık kaynak olarak yayımlanması ve insan katılımcı içermeyen, virgülle ayrılmış değerler (CSV) biçimindeki koşu günlüklerinin veri seti olarak paylaşılmasıdır.</ns0:t>
+              <ns0:t>Beklenen çıktılar bitirme tezinin deney bölümü, ulusal bir bildiri, doğrulayıcı bileşen ile köy sahnesinin açık kaynak olarak yayımlanması ve insan katılımcı içermeyen koşu günlüklerinin veri seti olarak paylaşılmasıdır.</ns0:t>
             </ns0:r>
           </ns0:p>
         </ns0:tc>
@@ -1093,7 +1093,7 @@
                 <ns0:sz ns0:val="18"/>
                 <ns0:szCs ns0:val="18"/>
               </ns0:rPr>
-              <ns0:t>Dijital oyunlarda oyuncu olmayan karakterin (NPC) söyleyebileceği cümleler çoğunlukla önceden yazıldığından, oyuncu yazarın ayırdığı dalların dışına çıktığında karakter aynı yanıtı tekrarlar. Etkileşimli anlatı literatürü bu sorunu oyuncu eylemine göre değişen hikâyeler ve kurallı görev yapılarıyla ele almış [1, 2], görev üreteçleri ise mevcut oyunların görev yapılarını çözümleyerek şablon çıkarmıştır [3]. Bu çizgi, serbest cümle üretiminde de anlatının oyun kurallarına bağlı kalması gerektiğini gösterir.</ns0:t>
+              <ns0:t>Dijital oyunlarda NPC’nin söyleyebileceği cümleler çoğunlukla önceden yazıldığından, oyuncu yazarın ayırdığı dalların dışına çıktığında karakter aynı yanıtı tekrarlar. Etkileşimli anlatı literatürü bu sorunu oyuncu eylemine göre değişen hikâyeler ve kurallı görev yapılarıyla ele almış [1, 2], görev üreteçleri ise mevcut oyunların görev yapılarını çözümleyerek şablon çıkarmıştır [3]. Bu çizgi, serbest cümle üretiminde de anlatının oyun kurallarına bağlı kalması gerektiğini gösterir.</ns0:t>
             </ns0:r>
           </ns0:p>
           <ns0:p>
@@ -1127,7 +1127,7 @@
                 <ns0:sz ns0:val="18"/>
                 <ns0:szCs ns0:val="18"/>
               </ns0:rPr>
-              <ns0:t xml:space="preserve">Motor içine taşınınca gecikme ikinci bir sınır olarak ortaya çıkar. Maslych ve arkadaşları Unity içinde 54 katılımcıyla 1,5, 4,0 ve 6,5 saniyelik yanıt gecikmelerini denemiş ve 4 saniyenin üzerindeki gecikmenin deneyim kalitesini düşürdüğünü bildirmiştir [10]; McGrath ve arkadaşları ise Unreal Engine 5 prototipinde GPT-4o mini için ortalama 1,9 saniyelik sunucu gecikmesi ölçmüştür [11]. Halüsinasyonun türleri ve azaltma yaklaşımları Ji ve arkadaşları tarafından taranmış [12], Willard ve Louf çıktıyı bir gramerle sınırlamanın geçersiz sözdizimini azalttığını göstermiş [13], Chen ve arkadaşları ise önbellek ve kademeli model seçimiyle maliyetin düşürülebileceğini incelemiştir [14]. Kumaran ve arkadaşlarının SceneCraft sistemi bir Unity sahnesi üretmekte, ancak çalışma tasarım anında yürütülmekte ve denetim sözdizimi düzeyinde kalmaktadır [15].</ns0:t>
+              <ns0:t xml:space="preserve">Motor içine taşınınca gecikme ikinci bir sınır olarak ortaya çıkar. Maslych ve arkadaşları Unity içinde 54 katılımcıyla 1,5, 4,0 ve 6,5 saniyelik yanıt gecikmelerini denemiş ve 4 saniyenin üzerindeki gecikmenin deneyim kalitesini düşürdüğünü bildirmiştir [10]; McGrath ve arkadaşları ise Unreal Engine 5 prototipinde GPT-4o mini için ortalama 1,9 saniyelik sunucu gecikmesi ölçmüştür [11]. Halüsinasyonun türleri ve azaltma yaklaşımları Ji ve arkadaşları tarafından taranmış [12], Willard ve Louf çıktıyı bir gramerle sınırlamanın geçersiz sözdizimini azalttığını göstermiş [13], Chen ve arkadaşları ise sorguyu önce ucuz, gerekirse daha pahalı modele ileten kademeli model seçimiyle maliyetin düşürülebileceğini incelemiştir [14]. Kumaran ve arkadaşlarının SceneCraft sistemi bir Unity sahnesi üretmekte, ancak çalışma tasarım anında yürütülmekte ve denetim sözdizimi düzeyinde kalmaktadır [15].</ns0:t>
             </ns0:r>
           </ns0:p>
           <ns0:p>
@@ -1144,7 +1144,7 @@
                 <ns0:sz ns0:val="18"/>
                 <ns0:szCs ns0:val="18"/>
               </ns0:rPr>
-              <ns0:t xml:space="preserve">Ticari eklentiler eylem eşlemeyi de ele almıştır: Convai dil modeli çıktısını kayıtlı eylemlere bağlayan bir eylem katmanı sunar, LLM for Unity yerel çıkarımda gramer kısıtı ve fonksiyon çağrısı sağlar, Inworld AI ile NVIDIA ACE ise konuşan karakter için ses ve dil modeli altyapısı kurar. Bu araçların sayfaları 2 Ekim 2026’da incelenmiştir (EK-1); eylem listesine eşleme ve JavaScript Object Notation (JSON) kısıtı bu nedenle tek başına bir katkı olarak sunulmamaktadır.</ns0:t>
+              <ns0:t xml:space="preserve">Ticari eklentiler eylem eşlemeyi de ele almıştır: Convai dil modeli çıktısını kayıtlı eylemlere bağlayan bir eylem katmanı sunar, LLM for Unity yerel çıkarımda gramer kısıtı ve fonksiyon çağrısı sağlar, Inworld AI ile NVIDIA ACE ise konuşan karakter için ses ve dil modeli altyapısı kurar. Bu araçların sayfaları 2 Ekim 2026’da incelenmiş ve adresleri EK-1’de verilmiştir. Bu araçlar yalnızca mevcut uygulamaları karşılaştırmak için anılmıştır, hiçbiri öne çıkarılmamaktadır. Eylem listesine eşleme ve JavaScript Object Notation (JSON) kısıtı bu nedenle tek başına bir katkı olarak sunulmamaktadır.</ns0:t>
             </ns0:r>
           </ns0:p>
           <ns0:p>
@@ -1178,7 +1178,7 @@
                 <ns0:sz ns0:val="18"/>
                 <ns0:szCs ns0:val="18"/>
               </ns0:rPr>
-              <ns0:t xml:space="preserve">Ana araştırma sorusu şudur: şema, izin ve ön koşul denetimine dayanan yapısal doğrulama, bir dil modelinin ürettiği NPC eylemlerindeki anlamsal tutarsızlıkların ne kadarını oyun durumuna ulaşmadan yakalayabilir? Soruyu yanıtlamak için doğrulayıcısız koşulda dil modelinin doğal istemlerde ne sıklıkla geçersiz eylem önerdiği (H2) ve doğrulayıcıdan sonra oyuncuya ulaşan yanıtlarda anlamsal tutarsızlığın ne ölçüde kaldığı (H3) birlikte ölçülür. Bağlamın kısaltılmasının token tasarrufu karşılığında tutarlılıktan ne kadar götürdüğü (H1) ile doğrulama ve bağlam yönetiminin kare süresini ne kadar etkilediği (H4) bu çerçevenin yardımcı sorularıdır.</ns0:t>
+              <ns0:t>Ana araştırma sorusu şudur: şema, izin ve ön koşul denetimine dayanan yapısal doğrulama, bir dil modelinin ürettiği NPC eylemlerindeki anlamsal tutarsızlıkların ne kadarını oyun durumuna ulaşmadan yakalayabilir? Soruyu yanıtlamak için H2’de doğrulama katmanı olmadan dil modelinin doğal istemlerde ne sıklıkla geçersiz eylem önerdiği, H3’te doğrulayıcıdan sonra oyuncuya ulaşan yanıtlarda anlamsal tutarsızlığın ne ölçüde kaldığı birlikte ölçülür. H1’de bağlamın kısaltılmasının token tasarrufu karşılığında tutarlılıktan ne kadar götürdüğü, H4’te ise doğrulama ve bağlam yönetiminin kare süresini ne kadar etkilediği sorulur; bu ikisi çerçevenin yardımcı sorularıdır.</ns0:t>
             </ns0:r>
           </ns0:p>
           <ns0:p>
@@ -1235,7 +1235,7 @@
                 <ns0:sz ns0:val="18"/>
                 <ns0:szCs ns0:val="18"/>
               </ns0:rPr>
-              <ns0:t xml:space="preserve"> Özet bellekli kısa bağlam, uzun bağlama göre girdi token sayısını azaltırken kontrol listesi başarı oranını belirlenen sınırın altına düşürmez; ödünleşim, bağlam penceresini katmanlı bellekle yönetme yaklaşımına [6] ve maliyeti düşürmeye yönelik istem uyarlamasına [14] dayanır. Ön eşik, pilot koşuda kilitlenmek üzere şöyledir: C2’de önbellek kapalıyken kısa bağlamda medyan girdi token sayısı uzun bağlamdan en az %25 düşüktür ve kontrol listesi başarı oranı en fazla 0,10 puan geridedir.</ns0:t>
+              <ns0:t xml:space="preserve"> Özet bellekli kısa bağlam, uzun bağlama göre girdi token sayısını azaltırken kontrol listesi başarı oranını belirlenen sınırın altına düşürmez; ödünleşim, bağlam penceresini katmanlı bellekle yönetme yaklaşımına [6] ve sorguları maliyet ile başarı dengesine göre farklı modellere yönlendiren kademeli model seçimine [14] dayanır. Ön eşik, pilot koşuda kilitlenmek üzere şöyledir: doğrulama ve önbelleğin birlikte çalıştığı C2 koşulunda önbellek kapalıyken kısa bağlamda medyan girdi token sayısı uzun bağlamdan en az %25 düşüktür ve kontrol listesi başarı oranı en fazla 0,10 puan geridedir.</ns0:t>
             </ns0:r>
           </ns0:p>
           <ns0:p>
@@ -1273,7 +1273,7 @@
                 <ns0:sz ns0:val="18"/>
                 <ns0:szCs ns0:val="18"/>
               </ns0:rPr>
-              <ns0:t xml:space="preserve"> Hata enjeksiyonu olmayan doğal istemlerde, doğrulayıcısız C1 koşulunda dil modeli oyun durumunu değiştirecek geçersiz eylemi ihmal edilemeyecek bir oranda önerir. Ön eşik, pilot koşuda kilitlenmek üzere şöyledir: iki modelden en az birinde oran %10 veya daha yüksektir. C2’de aynı girdilerle oyun durumunu değiştiren geçersiz eylem sayısı 0 olmalıdır; bu, doğrulayıcının kabul kapısıdır.</ns0:t>
+              <ns0:t xml:space="preserve"> Bilerek bozuk girdi eklenmeyen doğal istemlerde, doğrulama katmanının uygulanmadığı C1 koşulunda dil modeli oyun durumunu değiştirecek geçersiz eylemi ihmal edilemeyecek bir oranda önerir. Ön eşik, pilot koşuda kilitlenmek üzere şöyledir: iki modelden en az birinde oran %10 veya daha yüksektir. C2’de aynı girdilerle oyun durumunu değiştiren geçersiz eylem sayısı 0 olmalıdır; bu, doğrulayıcının geçmesi zorunlu kabul testidir.</ns0:t>
             </ns0:r>
           </ns0:p>
           <ns0:p>
@@ -1311,7 +1311,7 @@
                 <ns0:sz ns0:val="18"/>
                 <ns0:szCs ns0:val="18"/>
               </ns0:rPr>
-              <ns0:t xml:space="preserve"> C2’de oyuncuya ulaşan yanıtların anlamsal kontrol (K5–K7) başarı oranı C1’dekinden yüksektir, ancak yapısal doğrulama anlamsal tutarsızlıkları tümüyle gidermez: oran, pilotta kilitlenen eşiğin (ön eşik: 0,95) altında kalır.</ns0:t>
+              <ns0:t xml:space="preserve"> C2’de oyuncuya ulaşan yanıtların Bölüm 2.4’te tanımlanan anlamsal kontrollerin (K5–K7) başarı oranı C1’dekinden yüksektir, ancak yapısal doğrulama anlamsal tutarsızlıkları tümüyle gidermez: oran, pilotta kilitlenen eşiğin (ön eşik: 0,95) altında kalır.</ns0:t>
             </ns0:r>
           </ns0:p>
           <ns0:p>
@@ -1802,16 +1802,16 @@
                 <ns0:sz ns0:val="18"/>
                 <ns0:szCs ns0:val="18"/>
               </ns0:rPr>
-              <ns0:t xml:space="preserve">Hedef 1. Dikey dilim ve kabul kapısı.</ns0:t>
-            </ns0:r>
-            <ns0:r>
-              <ns0:rPr>
-                <ns0:rFonts ns0:ascii="Arial" ns0:hAnsi="Arial" ns0:cs="Arial" ns0:eastAsia="Arial"/>
-                <ns0:color ns0:val="000000"/>
-                <ns0:sz ns0:val="18"/>
-                <ns0:szCs ns0:val="18"/>
-              </ns0:rPr>
-              <ns0:t xml:space="preserve"> Tek köy, iki NPC ve bir görev zinciri uçtan uca çalışır; beş kabul senaryosunun (S1–S5) her biri betikteki haliyle en az bir kez geçer ve kaydedilmiş 30 bozuk ya da izinsiz yanıtta oyun durumu değişmez. Son sonuç bir hipotez değil, doğrulayıcının birim testi niteliğindeki kabul kapısıdır.</ns0:t>
+              <ns0:t xml:space="preserve">Hedef 1. Dikey dilim ve kabul testi.</ns0:t>
+            </ns0:r>
+            <ns0:r>
+              <ns0:rPr>
+                <ns0:rFonts ns0:ascii="Arial" ns0:hAnsi="Arial" ns0:cs="Arial" ns0:eastAsia="Arial"/>
+                <ns0:color ns0:val="000000"/>
+                <ns0:sz ns0:val="18"/>
+                <ns0:szCs ns0:val="18"/>
+              </ns0:rPr>
+              <ns0:t xml:space="preserve"> Tek köy, iki NPC ve bir görev zinciri uçtan uca çalışır; beş kabul senaryosunun (S1–S5) her biri betikteki haliyle en az bir kez geçer ve kaydedilmiş 30 bozuk ya da izinsiz yanıtta oyun durumu değişmez. Son sonuç bir hipotez değil, doğrulayıcının birim testi niteliğindeki zorunlu kabul testidir.</ns0:t>
             </ns0:r>
           </ns0:p>
           <ns0:p>
@@ -1840,7 +1840,7 @@
                 <ns0:sz ns0:val="18"/>
                 <ns0:szCs ns0:val="18"/>
               </ns0:rPr>
-              <ns0:t xml:space="preserve">Hedef 2. Bağlam ödünleşimi (H1).</ns0:t>
+              <ns0:t xml:space="preserve">Hedef 2. H1: bağlam ödünleşimi.</ns0:t>
             </ns0:r>
             <ns0:r>
               <ns0:rPr>
@@ -1878,7 +1878,7 @@
                 <ns0:sz ns0:val="18"/>
                 <ns0:szCs ns0:val="18"/>
               </ns0:rPr>
-              <ns0:t xml:space="preserve">Hedef 3. Doğal geçersiz eylem oranı (H2).</ns0:t>
+              <ns0:t xml:space="preserve">Hedef 3. H2: doğal geçersiz eylem oranı.</ns0:t>
             </ns0:r>
             <ns0:r>
               <ns0:rPr>
@@ -1916,7 +1916,7 @@
                 <ns0:sz ns0:val="18"/>
                 <ns0:szCs ns0:val="18"/>
               </ns0:rPr>
-              <ns0:t xml:space="preserve">Hedef 4. Anlamsal tutarlılık (H3).</ns0:t>
+              <ns0:t xml:space="preserve">Hedef 4. H3: anlamsal tutarlılık.</ns0:t>
             </ns0:r>
             <ns0:r>
               <ns0:rPr>
@@ -1954,7 +1954,7 @@
                 <ns0:sz ns0:val="18"/>
                 <ns0:szCs ns0:val="18"/>
               </ns0:rPr>
-              <ns0:t xml:space="preserve">Hedef 5. Akıcılık ve gecikme (H4).</ns0:t>
+              <ns0:t xml:space="preserve">Hedef 5. H4: akıcılık ve gecikme.</ns0:t>
             </ns0:r>
             <ns0:r>
               <ns0:rPr>
@@ -2374,7 +2374,7 @@
                 <ns0:sz ns0:val="18"/>
                 <ns0:szCs ns0:val="18"/>
               </ns0:rPr>
-              <ns0:t xml:space="preserve">Çalışma, aynı olay betiğinin üç sistem koşulunda ve iki dil modelinde tekrarlandığı, uygulamalı ve karşılaştırmalı bir deneydir (Tablo 1). C0 yazarın yazdığı yanıt ve görevle çalışan, dil modeli, token ve önbellek içermeyen taban çizgisidir; geçersiz eylem oranı ve token ölçütleri yalnızca C1 ve C2 için hesaplanır. C1 denetimsiz üretimin oyun durumu üzerindeki etkisini gösterir ve eylemi her koşuda sıfırlanan bir deney durumuna yazar; C2 ise başvurunun asıl sistemidir. Modeller M1 (barındırılan ticari model) ve M2 (açık ağırlıklı model, Llama veya Qwen sınıfı; ölçüm bilgisayarından ayrı, kiralanan GPU’lu bir çıkarım sunucusunda çalışır) olarak adlandırılır ve ikisi de aynı JSON sözleşmesini ve aynı istem metnini kullanır. H1, C2’nin kısa ve uzun bağlam kolları arasında; H2, C1’de; H3, C1 ile C2 arasında; H4 ise iki modelde de C1 ve C2 koşullarında kare süresi olarak okunur.</ns0:t>
+              <ns0:t>Çalışma, aynı olay betiğinin üç sistem koşulunda ve iki dil modelinde tekrarlandığı, uygulamalı ve karşılaştırmalı bir deneydir. Koşullar Tablo 1’de verilmiştir. C0 yazarın yazdığı yanıt ve görevle çalışan, dil modeli, token ve önbellek içermeyen taban çizgisidir; geçersiz eylem oranı ve token ölçütleri yalnızca C1 ve C2 için hesaplanır. C1 doğrulama olmadan yapılan üretimin oyun durumu üzerindeki etkisini gösterir ve eylemi her koşuda sıfırlanan bir deney durumuna yazar; C2 ise başvurunun asıl sistemidir. Modeller M1 (barındırılan ticari model) ve M2 (açık ağırlıklı model, Llama veya Qwen sınıfı; ölçüm bilgisayarından ayrı, kiralanan GPU’lu bir çıkarım sunucusunda çalışır) olarak adlandırılır ve ikisi de aynı JSON sözleşmesini ve aynı istem metnini kullanır. H1, C2’nin kısa ve uzun bağlam kolları arasında; H2, C1’de; H3, C1 ile C2 arasında; H4 ise iki modelde de C1 ve C2 koşullarında kare süresi olarak okunur.</ns0:t>
             </ns0:r>
           </ns0:p>
           <ns0:p>
@@ -2856,7 +2856,7 @@
                 <ns0:sz ns0:val="18"/>
                 <ns0:szCs ns0:val="18"/>
               </ns0:rPr>
-              <ns0:t xml:space="preserve">Akış (Şekil 1) bir olayla başlar: Unity olayı ilgili NPC’nin beynine iletilir, beyin algı, bellek ve karar adımlarının ardından istemi hazırlar ve istem, API anahtarının durduğu aracı sunucu üzerinden modele asenkron olarak gider. Dönen JSON şema, izinli eylem, hedef, görev ve ön koşul açısından denetlenir; denetimden geçerse yürütücü eylemi uygular, geçmezse, zaman aşımı olursa ya da yanıtın durum sürümü güncel değilse oyun durumu değişmez ve yedek diyalog oynatılır.</ns0:t>
+              <ns0:t>Şekil 1’deki akış bir olayla başlar: Unity olayı ilgili NPC’nin beynine iletilir, beyin algı, bellek ve karar adımlarının ardından istemi hazırlar ve istem, API anahtarının durduğu aracı sunucu üzerinden modele asenkron olarak gider. Dönen JSON şema, izinli eylem, hedef, görev ve ön koşul açısından denetlenir; denetimden geçerse yürütücü eylemi uygular, geçmezse, zaman aşımı olursa ya da yanıtın durum sürümü güncel değilse oyun durumu değişmez ve yedek diyalog oynatılır.</ns0:t>
             </ns0:r>
           </ns0:p>
           <ns0:p>
@@ -2944,7 +2944,7 @@
                 <ns0:sz ns0:val="18"/>
                 <ns0:szCs ns0:val="18"/>
               </ns0:rPr>
-              <ns0:t xml:space="preserve">İş paketleriyle (İP) ilişki şöyledir: İP1 doğrulama parçasını, S1–S5 kapısını ve kontrol listesi ölçüm betiğini kurar, İP2 canlı çağrılarla dikey dilimi açar, İP3 ikinci modeli, önbelleği, bağlam bütçesini ve günlük alanlarını ekleyip pilotla eşikleri kilitler, İP4 ise koşuları yürütür ve hipotezleri çözümler.</ns0:t>
+              <ns0:t xml:space="preserve">İş paketleriyle (İP) ilişki şöyledir: İP1 doğrulama parçasını, S1–S5 kabul testlerini ve kontrol listesi ölçüm betiğini kurar, İP2 canlı çağrılarla dikey dilimi açar, İP3 ikinci modeli, önbelleği, bağlam bütçesini ve günlük alanlarını ekleyip pilotla eşikleri kilitler, İP4 ise koşuları yürütür ve hipotezleri çözümler.</ns0:t>
             </ns0:r>
           </ns0:p>
           <ns0:p>
@@ -3118,7 +3118,7 @@
                 <ns0:sz ns0:val="18"/>
                 <ns0:szCs ns0:val="18"/>
               </ns0:rPr>
-              <ns0:t xml:space="preserve">Hata enjeksiyonu (yalnız S4 ve S5 kabul testleri, kaydedilmiş girdiyle): yok, bozuk JSON, izin listesinde olmayan eylem, yapay zaman aşımı.</ns0:t>
+              <ns0:t xml:space="preserve">Hata enjeksiyonu (kaydedilmiş girdiye bilerek bozuk yanıt eklenmesi; yalnız S4 ve S5 kabul testleri): yok, bozuk JSON, izin listesinde olmayan eylem, yapay zaman aşımı.</ns0:t>
             </ns0:r>
           </ns0:p>
           <ns0:p>
@@ -3533,7 +3533,7 @@
                 <ns0:sz ns0:val="18"/>
                 <ns0:szCs ns0:val="18"/>
               </ns0:rPr>
-              <ns0:t xml:space="preserve">Durum sürümü JSON’un dışında, isteğin yanında tutulur; dönüş geldiğinde sahne sürümü değişmişse yanıt bayattır ve yedek diyaloğa yönlendirilir. Yinelenen ödül işlem kimliği ile engellenir, çünkü aynı kimlik ikinci kez ödül yazamaz.</ns0:t>
+              <ns0:t>Durum sürümü JSON’un dışında, isteğin yanında tutulur; dönüş geldiğinde sahne sürümü değişmişse yanıt bayattır ve yedek diyaloğa yönlendirilir. Yinelenen ödül işlem kimliği ile engellenir, çünkü aynı kimlik ikinci kez ödül yazamaz. Beş kabul senaryosunun kurulum ve geçer sonucu Tablo 2’de verilmiştir.</ns0:t>
             </ns0:r>
           </ns0:p>
           <ns0:p>
@@ -4067,7 +4067,7 @@
                 <ns0:sz ns0:val="18"/>
                 <ns0:szCs ns0:val="18"/>
               </ns0:rPr>
-              <ns0:t xml:space="preserve">S4 ve S5 bilerek bozulmuş girdi içerdiğinden kaydedilmiş yanıtlarla ağ olmadan koşulur ve doğrulayıcının birim testi işlevi görür: 30 kayıtlı bozuk JSON veya izinsiz eylemde oyun durumu değişmemelidir. İzin listesine bakan bir doğrulayıcı listede olmayan eylemi geçirmeyeceği için bu sayı bir hipotez değil, kabul kapısıdır. S1–S3 ise doğrulayıcının geçerli akışı da kabul ettiğini gösterir; S1’i geçemeyen bir doğrulayıcı her şeyi reddettiğinden başarısız kabul edilir.</ns0:t>
+              <ns0:t xml:space="preserve">S4 ve S5 bilerek bozulmuş girdi içerdiğinden kaydedilmiş yanıtlarla ağ olmadan koşulur ve doğrulayıcının birim testi işlevi görür: 30 kayıtlı bozuk JSON veya izinsiz eylemde oyun durumu değişmemelidir. İzin listesine bakan bir doğrulayıcı listede olmayan eylemi geçirmeyeceği için bu sayı bir hipotez değil, zorunlu kabul testidir. S1–S3 ise doğrulayıcının geçerli akışı da kabul ettiğini gösterir; S1’i geçemeyen bir doğrulayıcı her şeyi reddettiğinden başarısız kabul edilir.</ns0:t>
             </ns0:r>
           </ns0:p>
           <ns0:p>
@@ -4104,7 +4104,7 @@
                 <ns0:sz ns0:val="18"/>
                 <ns0:szCs ns0:val="18"/>
               </ns0:rPr>
-              <ns0:t xml:space="preserve">Tutarlılık 1–5 arası öznel bir puanla değil, her yanıta uygulanan yedi kontrolün sayımıyla ölçülür (Tablo 3). Kontroller doğrulayıcıdan bağımsız bir ölçüm betiğiyle çalıştığı için ölçüm, doğrulayıcının denetim alanından bağımsız kalır. K1–K4 yapısal sınıftır ve doğrulayıcının doğrudan denetlediği alanları kapsar; K5–K7 anlamsal sınıftır, diyalog metni ile oyun durumu arasındaki ilişkiye bakar ve doğrulayıcının denetim alanı dışında kalır.</ns0:t>
+              <ns0:t>Tutarlılık 1–5 arası öznel bir puanla değil, her yanıta uygulanan Tablo 3’te sıralanan yedi kontrolün sayımıyla ölçülür. Kontroller doğrulayıcıdan bağımsız bir ölçüm betiğiyle çalıştığı için ölçüm, doğrulayıcının denetim alanından bağımsız kalır. K1–K4 yapısal sınıftır ve doğrulayıcının doğrudan denetlediği alanları kapsar; K5–K7 anlamsal sınıftır, diyalog metni ile oyun durumu arasındaki ilişkiye bakar ve doğrulayıcının denetim alanı dışında kalır.</ns0:t>
             </ns0:r>
           </ns0:p>
           <ns0:p>
@@ -5067,7 +5067,7 @@
                 <ns0:sz ns0:val="18"/>
                 <ns0:szCs ns0:val="18"/>
               </ns0:rPr>
-              <ns0:t xml:space="preserve"> C1 kısa hücresinde durumu değiştiren geçersiz eylemin oranı Clopper–Pearson %95 güven aralığıyla raporlanır ve iki modelin oranları Fisher kesin testiyle karşılaştırılır. C2’de aynı girdilerle sayı sıfır değilse doğrulayıcı kabul kapısını geçememiştir ve testin sonucuna bakılmaz.</ns0:t>
+              <ns0:t xml:space="preserve"> C1 kısa hücresinde durumu değiştiren geçersiz eylemin oranı Clopper–Pearson %95 güven aralığıyla raporlanır ve iki modelin oranları Fisher kesin testiyle karşılaştırılır. C2’de aynı girdilerle sayı sıfır değilse doğrulayıcı kabul testini geçememiştir ve testin sonucuna bakılmaz.</ns0:t>
             </ns0:r>
           </ns0:p>
           <ns0:p>
@@ -5205,7 +5205,7 @@
                 <ns0:sz ns0:val="18"/>
                 <ns0:szCs ns0:val="18"/>
               </ns0:rPr>
-              <ns0:t xml:space="preserve">Ekim 2026’da Unity 6000.6.0f1 ve Evrensel Render Hattı (URP) 17.6.0 ile bir proje kurulmuş; olay yöneticisi, NPC beyni, dil modeli istemcisi, eylem doğrulayıcı ve oyun yürütücüsü için 13 dosyalık arayüz ve veri sözleşmesi yazılarak derlenmiştir (Şekil 2). Taşıma politikasında zaman aşımı ve sınırlı yeniden deneme alanları bulunur, yedek nedenleri API yok, geçersiz JSON, doğrulama reddi ve bayat yanıt olarak dört başlıkta tanımlıdır ve doğrulayıcıya gelen dünya görünümü envanter, bilinen görev, bilinen hedef, izinli eylem ve durum sürümünü taşır. Derleme 8 Ekim 2026’da konsolda hata vermeden tamamlanmıştır.</ns0:t>
+              <ns0:t>Ekim 2026’da Unity 6000.6.0f1 ve Evrensel Render Hattı (URP) 17.6.0 ile bir proje kurulmuş; olay yöneticisi, NPC beyni, dil modeli istemcisi, eylem doğrulayıcı ve oyun yürütücüsü için 13 dosyalık arayüz ve veri sözleşmesi yazılarak derlenmiştir. Derlenen dosyalar Şekil 2’de gösterilmiştir. Taşıma politikasında zaman aşımı ve sınırlı yeniden deneme alanları bulunur, yedek nedenleri API yok, geçersiz JSON, doğrulama reddi ve bayat yanıt olarak dört başlıkta tanımlıdır ve doğrulayıcıya gelen dünya görünümü envanter, bilinen görev, bilinen hedef, izinli eylem ve durum sürümünü taşır. Derleme 8 Ekim 2026’da konsolda hata vermeden tamamlanmıştır.</ns0:t>
             </ns0:r>
           </ns0:p>
           <ns0:p>
@@ -7632,7 +7632,7 @@
                 <ns0:szCs ns0:val="18"/>
                 <ns0:color ns0:val="000000"/>
               </ns0:rPr>
-              <ns0:t xml:space="preserve">İzin listesi ve ön koşul tablosu senaryo betiğiyle satır satır karşılaştırılır. Çözüm kuralları kapatmak değil, yanlış kuralı düzeltmektir ve S1 geçmeden H2’nin kabul kapısı sağlanmış sayılmaz.</ns0:t>
+              <ns0:t xml:space="preserve">İzin listesi ve ön koşul tablosu senaryo betiğiyle satır satır karşılaştırılır. Çözüm kuralları kapatmak değil, yanlış kuralı düzeltmektir ve S1 geçmeden H2’nin zorunlu kabul testi geçilmiş sayılmaz.</ns0:t>
             </ns0:r>
           </ns0:p>
         </ns0:tc>
@@ -8652,7 +8652,7 @@
           <ns0:sz ns0:val="18"/>
           <ns0:szCs ns0:val="18"/>
         </ns0:rPr>
-        <ns0:t xml:space="preserve">Proje mevcut altyapıya ek olarak yalnızca M2’nin çıkarımı için saatlik kiralanan bir GPU sunucusuna dayanır (Bölüm 5).</ns0:t>
+        <ns0:t xml:space="preserve">Proje mevcut altyapıya ek olarak yalnızca M2’nin çıkarımı için saatlik kiralanan bir GPU sunucusuna dayanır; ayrıntısı Bölüm 5’te verilmiştir.</ns0:t>
       </ns0:r>
     </ns0:p>
     <ns0:p ns0:rsidR="00000000" ns0:rsidDel="00000000" ns0:rsidP="00000000" ns0:rsidRDefault="00000000" ns0:rsidRPr="00000000" ns1:paraId="9FB4C039">
@@ -9083,7 +9083,7 @@
                 <ns0:szCs ns0:val="18"/>
                 <ns0:color ns0:val="000000"/>
               </ns0:rPr>
-              <ns0:t xml:space="preserve">Hipotez ve ölçüm tabloları bitirme tezinin deney bölümüne yazılır ve aynı tablolardan, yapısal doğrulamanın anlamsal tutarsızlıkları yakalama düzeyini konu alan bir bildiri hazırlanarak Uluslararası Bilgisayar Bilimleri ve Mühendisliği Konferansı (UBMK) veya Akademik Bilişim Konferansı’na gönderilir. Veri, insan katılımcı içermeyen koşu günlüğüdür.</ns0:t>
+              <ns0:t>Hipotez ve ölçüm tabloları bitirme tezinin deney bölümüne yazılır ve aynı tablolardan, yapısal doğrulamanın anlamsal tutarsızlıkları yakalama düzeyini konu alan ulusal bir bildiri hazırlanır. Veri, insan katılımcı içermeyen koşu günlüğüdür.</ns0:t>
             </ns0:r>
           </ns0:p>
         </ns0:tc>
@@ -12733,7 +12733,7 @@
           <ns0:sz ns0:val="18"/>
           <ns0:szCs ns0:val="18"/>
         </ns0:rPr>
-        <ns0:t xml:space="preserve">Birim fiyatlar, seçilecek model ve sağlayıcının başvuru öncesindeki güncel fiyatlarıyla yeniden hesaplanmak üzere, üst düzey bir model varsayımıyla milyon girdi tokenı için 500 TL ve milyon çıktı tokenı için 2.000 TL alınmıştır. Düşünme belirteçleri çıktıyı artırabileceğinden çıktı sayısı dört katına çıkarılmış ve 0,9 × 500 + 0,162 × 4 × 2.000 ≈ 1.746 TL, yani yaklaşık 2.000 TL bulunmuştur. M2 için kiralama süresi 160 saat öngörülmüştür: kurulum ve sürüm denemeleri için 20, İP3’teki entegrasyon ve pilot için 70, İP4’teki koşular ve yeniden koşular için 70 saat. Güncel karşılaştırmalara göre 24 GB belleğe sahip bir GPU’nun bulut liste fiyatı saatte yaklaşık 0,3–0,75 ABD dolarıdır (Ekim 2026 kuru olan yaklaşık 49,4 TL ile 17–37 TL); kur, vergi ve komisyon payıyla saatlik bedel 50 TL alınmış ve 160 saat için 8.000 TL bulunmuştur. Kur ve liste fiyatı değişimi ile kesinti sonrası yeniden koşular için iki kalemin toplamının %20’si, yani 2.000 TL pay eklenmiş ve talep edilen toplam 12.000 TL olarak belirlenmiştir (Tablo 6).</ns0:t>
+        <ns0:t>Birim fiyatlar, seçilecek model ve sağlayıcının başvuru öncesindeki güncel fiyatlarıyla yeniden hesaplanmak üzere, üst düzey bir model varsayımıyla milyon girdi tokenı için 500 TL ve milyon çıktı tokenı için 2.000 TL alınmıştır. Düşünme tokenları çıktıyı artırabileceğinden çıktı sayısı dört katına çıkarılmış ve 0,9 × 500 + 0,162 × 4 × 2.000 ≈ 1.746 TL, yani yaklaşık 2.000 TL bulunmuştur. M2 için kiralama süresi 160 saat öngörülmüştür: kurulum ve sürüm denemeleri için 20, İP3’teki entegrasyon ve pilot için 70, İP4’teki koşular ve yeniden koşular için 70 saat. Güncel karşılaştırmalara göre 24 GB belleğe sahip bir GPU’nun bulut liste fiyatı saatte yaklaşık 0,3–0,75 ABD dolarıdır (Ekim 2026 kuru olan yaklaşık 49,4 TL ile 15–37 TL); kur, vergi ve komisyon payıyla saatlik bedel 50 TL alınmış ve 160 saat için 8.000 TL bulunmuştur. Kur ve liste fiyatı değişimi ile kesinti sonrası yeniden koşular için iki kalemin toplamının %20’si, yani 2.000 TL pay eklenmiş ve talep edilen toplam 12.000 TL olarak belirlenmiştir. Kalemler Tablo 6’da gösterilmiştir. Kalemlerin tümü programın destek kapsamındaki hizmet alımı giderleridir; kongre katılımı, yayın, konaklama ve gündelik gideri bütçeye eklenmemiştir ve toplam, programın 12.000 TL üst sınırını aşmaz.</ns0:t>
       </ns0:r>
     </ns0:p>
     <ns0:p>
@@ -13739,7 +13739,7 @@
           <ns0:sz ns0:val="18"/>
           <ns0:szCs ns0:val="18"/>
         </ns0:rPr>
-        <ns0:t xml:space="preserve"> Bu önerinin hazırlanmasında iki üretken yapay zekâ aracından yararlanılmıştır: Cursor üzerinden xAI’nin Grok 4.7 modeli, proje tabanının (Unity proje iskeleti ve yazılım sözleşmeleri) ve önerinin ilk yazımı dahil başlangıç belgelerinin hazırlanmasında; Anthropic’in Claude Sonnet 5.5 modeli (Claude Code aracılığıyla) ise 22 Ekim 2026 tarihli sürümde danışman geri bildirimine göre hipotezlerin, yöntemin ve bütçenin yeniden kurulmasında, metnin yazılıp düzenlenmesinde, tablo ve şekillerin hazırlanmasında ve çağrı metinleriyle karşılaştırılmasında kullanılmıştır. Kullanım, TÜBİTAK’ın “Destek Süreçlerinde Üretken Yapay Zekânın (ÜYZ) Sorumlu ve Güvenilir Kullanımı Rehberi” çerçevesinde beyan edilmektedir; içeriğin doğruluğundan ve özgünlüğünden proje yürütücüsü ile akademik danışman sorumludur.</ns0:t>
+        <ns0:t xml:space="preserve"> Bu önerinin hazırlanmasında iki üretken yapay zekâ aracından yararlanılmıştır: Cursor üzerinden xAI’nin Grok 4.7 modeli, proje tabanının (Unity proje iskeleti ve yazılım sözleşmeleri) ve önerinin ilk yazımı dahil başlangıç belgelerinin hazırlanmasında; Anthropic’in Claude Sonnet 5.5 modeli (Claude Code aracılığıyla) ise 22 Ekim 2026 tarihli sürümde danışman geri bildirimine göre hipotezlerin, yöntemin ve bütçenin yeniden kurulmasında, metnin yazılıp düzenlenmesinde, tablo ve şekillerin hazırlanmasında ve çağrı metinleriyle karşılaştırılmasında kullanılmıştır. Aynı model 30 Ekim 2026 tarihli sürümde Cursor üzerinden, kaynakların DOI ve URL doğrulamasında, 2026 çağrısının başvuru içeriği bilgi notuna uygunluk denetiminde ve metin düzeltmelerinde kullanılmıştır. Kullanım, TÜBİTAK’ın “Destek Süreçlerinde Üretken Yapay Zekânın (ÜYZ) Sorumlu ve Güvenilir Kullanımı Rehberi” çerçevesinde beyan edilmektedir; içeriğin doğruluğundan ve özgünlüğünden proje yürütücüsü ile akademik danışman sorumludur.</ns0:t>
       </ns0:r>
     </ns0:p>
     <ns0:p ns1:paraId="1C9BE3A6">
@@ -13887,7 +13887,7 @@
           <ns0:szCs ns0:val="18"/>
           <ns0:color ns0:val="000000"/>
         </ns0:rPr>
-        <ns0:t xml:space="preserve">Bu adresler akademik kaynak değildir; 2 Ekim 2026’da özellik karşılaştırması için açılmıştır.</ns0:t>
+        <ns0:t xml:space="preserve">Bu adresler akademik kaynak değildir; 2 Ekim 2026’da özellik karşılaştırması için açılmıştır; araçlar öne çıkarılmak için değil, karşılaştırma amacıyla listelenmiştir.</ns0:t>
       </ns0:r>
     </ns0:p>
     <ns0:p ns1:paraId="CA8CDAAA">
@@ -13918,7 +13918,7 @@
           <ns0:szCs ns0:val="18"/>
           <ns0:color ns0:val="000000"/>
         </ns0:rPr>
-        <ns0:t xml:space="preserve">Convai. https://convai.com</ns0:t>
+        <ns0:t>Convai. Son erişim tarihi: 30 Ekim 2026, url: https://convai.com</ns0:t>
       </ns0:r>
     </ns0:p>
     <ns0:p ns1:paraId="381BDDAA">
@@ -13949,7 +13949,7 @@
           <ns0:szCs ns0:val="18"/>
           <ns0:color ns0:val="000000"/>
         </ns0:rPr>
-        <ns0:t xml:space="preserve">Inworld AI. https://inworld.ai</ns0:t>
+        <ns0:t>Inworld AI. Son erişim tarihi: 30 Ekim 2026, url: https://inworld.ai</ns0:t>
       </ns0:r>
     </ns0:p>
     <ns0:p ns1:paraId="E492168D">
@@ -13980,7 +13980,7 @@
           <ns0:szCs ns0:val="18"/>
           <ns0:color ns0:val="000000"/>
         </ns0:rPr>
-        <ns0:t xml:space="preserve">LLM for Unity. https://github.com/undreamai/LLMUnity</ns0:t>
+        <ns0:t>LLM for Unity. Son erişim tarihi: 30 Ekim 2026, url: https://github.com/undreamai/LLMUnity</ns0:t>
       </ns0:r>
     </ns0:p>
     <ns0:p ns1:paraId="7797003E">
@@ -14011,7 +14011,7 @@
           <ns0:szCs ns0:val="18"/>
           <ns0:color ns0:val="000000"/>
         </ns0:rPr>
-        <ns0:t xml:space="preserve">NVIDIA ACE. https://developer.nvidia.com/ace</ns0:t>
+        <ns0:t>NVIDIA ACE. Son erişim tarihi: 30 Ekim 2026, url: https://developer.nvidia.com/ace</ns0:t>
       </ns0:r>
     </ns0:p>
     <ns0:p ns0:rsidR="00000000" ns0:rsidDel="00000000" ns0:rsidP="00000000" ns0:rsidRDefault="00000000" ns0:rsidRPr="00000000">
@@ -14060,7 +14060,7 @@
           <ns0:szCs ns0:val="18"/>
           <ns0:color ns0:val="000000"/>
         </ns0:rPr>
-        <ns0:t>[1] Mateas, M. ve Stern, A. (2005). Structuring content in the Façade interactive drama architecture. Proceedings of the AAAI Conference on Artificial Intelligence and Interactive Digital Entertainment, 1(1), 93–98. https://doi.org/10.1609/aiide.v1i1.18722</ns0:t>
+        <ns0:t>[1] Mateas, M. ve Stern, A. (2005). Structuring content in the Façade interactive drama architecture. Proceedings of the AAAI Conference on Artificial Intelligence and Interactive Digital Entertainment, 1(1), 93–98. url: https://doi.org/10.1609/aiide.v1i1.18722</ns0:t>
       </ns0:r>
     </ns0:p>
     <ns0:p ns0:rsidR="00000000" ns0:rsidDel="00000000" ns0:rsidP="00000000" ns0:rsidRDefault="00000000" ns0:rsidRPr="00000000">
@@ -14091,7 +14091,7 @@
           <ns0:szCs ns0:val="18"/>
           <ns0:color ns0:val="000000"/>
         </ns0:rPr>
-        <ns0:t>[2] Riedl, M. O. ve Bulitko, V. (2013). Interactive narrative: An intelligent systems approach. AI Magazine, 34(1), 67–77. https://doi.org/10.1609/aimag.v34i1.2449</ns0:t>
+        <ns0:t>[2] Riedl, M. O. ve Bulitko, V. (2013). Interactive narrative: An intelligent systems approach. AI Magazine, 34(1), 67–77. url: https://doi.org/10.1609/aimag.v34i1.2449</ns0:t>
       </ns0:r>
     </ns0:p>
     <ns0:p ns0:rsidR="00000000" ns0:rsidDel="00000000" ns0:rsidP="00000000" ns0:rsidRDefault="00000000" ns0:rsidRPr="00000000">
@@ -14122,7 +14122,7 @@
           <ns0:szCs ns0:val="18"/>
           <ns0:color ns0:val="000000"/>
         </ns0:rPr>
-        <ns0:t xml:space="preserve">[3] Doran, J. ve Parberry, I. (2011). A prototype quest generator based on a structural analysis of quests from four MMORPGs. Proceedings of the 2nd International Workshop on Procedural Content Generation in Games (ss. 1–8). ACM. https://doi.org/10.1145/2000919.2000920</ns0:t>
+        <ns0:t>[3] Doran, J. ve Parberry, I. (2011). A prototype quest generator based on a structural analysis of quests from four MMORPGs. Proceedings of the 2nd International Workshop on Procedural Content Generation in Games (ss. 1–8). ACM. url: https://doi.org/10.1145/2000919.2000920</ns0:t>
       </ns0:r>
     </ns0:p>
     <ns0:p ns0:rsidR="00000000" ns0:rsidDel="00000000" ns0:rsidP="00000000" ns0:rsidRDefault="00000000" ns0:rsidRPr="00000000">
@@ -14153,7 +14153,7 @@
           <ns0:szCs ns0:val="18"/>
           <ns0:color ns0:val="000000"/>
         </ns0:rPr>
-        <ns0:t>[4] Gallotta, R., Todd, G., Zammit, M., Earle, S., Liapis, A., Togelius, J. ve Yannakakis, G. N. (2024). Large language models and games: A survey and roadmap. IEEE Transactions on Games. Erken görünüm. https://doi.org/10.1109/TG.2024.3461510</ns0:t>
+        <ns0:t>[4] Gallotta, R., Todd, G., Zammit, M., Earle, S., Liapis, A., Togelius, J. ve Yannakakis, G. N. (2024). Large language models and games: A survey and roadmap. IEEE Transactions on Games. Erken görünüm. url: https://doi.org/10.1109/TG.2024.3461510</ns0:t>
       </ns0:r>
     </ns0:p>
     <ns0:p ns0:rsidR="00000000" ns0:rsidDel="00000000" ns0:rsidP="00000000" ns0:rsidRDefault="00000000" ns0:rsidRPr="00000000">
@@ -14184,7 +14184,7 @@
           <ns0:szCs ns0:val="18"/>
           <ns0:color ns0:val="000000"/>
         </ns0:rPr>
-        <ns0:t xml:space="preserve">[5] Park, J. S., O’Brien, J. C., Cai, C. J., Morris, M. R., Liang, P. ve Bernstein, M. S. (2023). Generative agents: Interactive simulacra of human behavior. Proceedings of the 36th Annual ACM Symposium on User Interface Software and Technology (ss. 1–22). ACM. https://doi.org/10.1145/3586183.3606763</ns0:t>
+        <ns0:t>[5] Park, J. S., O’Brien, J. C., Cai, C. J., Morris, M. R., Liang, P. ve Bernstein, M. S. (2023). Generative agents: Interactive simulacra of human behavior. Proceedings of the 36th Annual ACM Symposium on User Interface Software and Technology (ss. 1–22). ACM. url: https://doi.org/10.1145/3586183.3606763</ns0:t>
       </ns0:r>
     </ns0:p>
     <ns0:p ns0:rsidR="00000000" ns0:rsidDel="00000000" ns0:rsidP="00000000" ns0:rsidRDefault="00000000" ns0:rsidRPr="00000000">
@@ -14215,7 +14215,7 @@
           <ns0:szCs ns0:val="18"/>
           <ns0:color ns0:val="000000"/>
         </ns0:rPr>
-        <ns0:t xml:space="preserve">[6] Packer, C., Wooders, S., Lin, K., Fang, V., Patil, S. G., Stoica, I. ve Gonzalez, J. E. (2023). MemGPT: Towards LLMs as operating systems (arXiv:2310.08560). arXiv. https://doi.org/10.48550/arXiv.2310.08560</ns0:t>
+        <ns0:t>[6] Packer, C., Wooders, S., Lin, K., Fang, V., Patil, S. G., Stoica, I. ve Gonzalez, J. E. (2023). MemGPT: Towards LLMs as operating systems (arXiv:2310.08560). arXiv. url: https://doi.org/10.48550/arXiv.2310.08560</ns0:t>
       </ns0:r>
     </ns0:p>
     <ns0:p ns0:rsidR="00000000" ns0:rsidDel="00000000" ns0:rsidP="00000000" ns0:rsidRDefault="00000000" ns0:rsidRPr="00000000">
@@ -14246,7 +14246,7 @@
           <ns0:szCs ns0:val="18"/>
           <ns0:color ns0:val="000000"/>
         </ns0:rPr>
-        <ns0:t xml:space="preserve">[7] Wang, G., Xie, Y., Jiang, Y., Mandlekar, A., Xiao, C., Zhu, Y., Fan, L. ve Anandkumar, A. (2024). Voyager: An open-ended embodied agent with large language models. Transactions on Machine Learning Research. https://openreview.net/forum?id=nfx5IutEed</ns0:t>
+        <ns0:t>[7] Wang, G., Xie, Y., Jiang, Y., Mandlekar, A., Xiao, C., Zhu, Y., Fan, L. ve Anandkumar, A. (2024). Voyager: An open-ended embodied agent with large language models. Transactions on Machine Learning Research. url: https://openreview.net/forum?id=nfx5IutEed</ns0:t>
       </ns0:r>
     </ns0:p>
     <ns0:p ns0:rsidR="00000000" ns0:rsidDel="00000000" ns0:rsidP="00000000" ns0:rsidRDefault="00000000" ns0:rsidRPr="00000000">
@@ -14277,7 +14277,7 @@
           <ns0:szCs ns0:val="18"/>
           <ns0:color ns0:val="000000"/>
         </ns0:rPr>
-        <ns0:t xml:space="preserve">[8] Ashby, T., Webb, B. K., Knapp, G., Searle, J. ve Fulda, N. (2023). Personalized quest and dialogue generation in role-playing games: A knowledge graph- and language model-based approach. Proceedings of the 2023 CHI Conference on Human Factors in Computing Systems (ss. 1–20). ACM. https://doi.org/10.1145/3544548.3581441</ns0:t>
+        <ns0:t>[8] Ashby, T., Webb, B. K., Knapp, G., Searle, J. ve Fulda, N. (2023). Personalized quest and dialogue generation in role-playing games: A knowledge graph- and language model-based approach. Proceedings of the 2023 CHI Conference on Human Factors in Computing Systems (ss. 1–20). ACM. url: https://doi.org/10.1145/3544548.3581441</ns0:t>
       </ns0:r>
     </ns0:p>
     <ns0:p ns0:rsidR="00000000" ns0:rsidDel="00000000" ns0:rsidP="00000000" ns0:rsidRDefault="00000000" ns0:rsidRPr="00000000">
@@ -14308,7 +14308,7 @@
           <ns0:szCs ns0:val="18"/>
           <ns0:color ns0:val="000000"/>
         </ns0:rPr>
-        <ns0:t xml:space="preserve">[9] Värtinen, S., Hämäläinen, P. ve Guckelsberger, C. (2024). Generating role-playing game quests with GPT language models. IEEE Transactions on Games, 16(1), 127–139. https://doi.org/10.1109/TG.2022.3228480</ns0:t>
+        <ns0:t>[9] Värtinen, S., Hämäläinen, P. ve Guckelsberger, C. (2024). Generating role-playing game quests with GPT language models. IEEE Transactions on Games, 16(1), 127–139. url: https://doi.org/10.1109/TG.2022.3228480</ns0:t>
       </ns0:r>
     </ns0:p>
     <ns0:p ns0:rsidR="00000000" ns0:rsidDel="00000000" ns0:rsidP="00000000" ns0:rsidRDefault="00000000" ns0:rsidRPr="00000000">
@@ -14339,7 +14339,7 @@
           <ns0:szCs ns0:val="18"/>
           <ns0:color ns0:val="000000"/>
         </ns0:rPr>
-        <ns0:t xml:space="preserve">[10] Maslych, M., Katebi, M., Lee, C., Hmaiti, Y., Ghasemaghaei, A., Pumarada, C., Palmer, J., Segarra Martinez, E., Emporio, M., Snipes, W., McMahan, R. P. ve LaViola, J. J., Jr. (2025). Mitigating response delays in free-form conversations with LLM-powered intelligent virtual agents. Proceedings of the 7th ACM Conference on Conversational User Interfaces (ss. 1–15). ACM. https://doi.org/10.1145/3719160.3736636</ns0:t>
+        <ns0:t>[10] Maslych, M., Katebi, M., Lee, C., Hmaiti, Y., Ghasemaghaei, A., Pumarada, C., Palmer, J., Segarra Martinez, E., Emporio, M., Snipes, W., McMahan, R. P. ve LaViola, J. J., Jr. (2025). Mitigating response delays in free-form conversations with LLM-powered intelligent virtual agents. Proceedings of the 7th ACM Conference on Conversational User Interfaces (ss. 1–15). ACM. url: https://doi.org/10.1145/3719160.3736636</ns0:t>
       </ns0:r>
     </ns0:p>
     <ns0:p ns0:rsidR="00000000" ns0:rsidDel="00000000" ns0:rsidP="00000000" ns0:rsidRDefault="00000000" ns0:rsidRPr="00000000">
@@ -14370,7 +14370,7 @@
           <ns0:szCs ns0:val="18"/>
           <ns0:color ns0:val="000000"/>
         </ns0:rPr>
-        <ns0:t xml:space="preserve">[11] McGrath, J., Lorandi, M. ve Belz, A. (2025). Echoes of Others: Real-time LLM dialogue generation for immersive NPC interaction. Proceedings of the 18th International Natural Language Generation Conference: System Demonstrations (ss. 1–2). Association for Computational Linguistics. https://aclanthology.org/2025.inlg-demos.1/</ns0:t>
+        <ns0:t>[11] McGrath, J., Lorandi, M. ve Belz, A. (2025). Echoes of Others: Real-time LLM dialogue generation for immersive NPC interaction. Proceedings of the 18th International Natural Language Generation Conference: System Demonstrations (ss. 1–2). Association for Computational Linguistics. url: https://aclanthology.org/2025.inlg-demos.1/</ns0:t>
       </ns0:r>
     </ns0:p>
     <ns0:p ns0:rsidR="00000000" ns0:rsidDel="00000000" ns0:rsidP="00000000" ns0:rsidRDefault="00000000" ns0:rsidRPr="00000000">
@@ -14401,7 +14401,7 @@
           <ns0:szCs ns0:val="18"/>
           <ns0:color ns0:val="000000"/>
         </ns0:rPr>
-        <ns0:t xml:space="preserve">[12] Ji, Z., Lee, N., Frieske, R., Yu, T., Su, D., Xu, Y., Ishii, E., Bang, Y. J., Madotto, A. ve Fung, P. (2023). Survey of hallucination in natural language generation. ACM Computing Surveys, 55(12), Makale 248. https://doi.org/10.1145/3571730</ns0:t>
+        <ns0:t>[12] Ji, Z., Lee, N., Frieske, R., Yu, T., Su, D., Xu, Y., Ishii, E., Bang, Y. J., Madotto, A. ve Fung, P. (2023). Survey of hallucination in natural language generation. ACM Computing Surveys, 55(12), Makale 248. url: https://doi.org/10.1145/3571730</ns0:t>
       </ns0:r>
     </ns0:p>
     <ns0:p ns0:rsidR="00000000" ns0:rsidDel="00000000" ns0:rsidP="00000000" ns0:rsidRDefault="00000000" ns0:rsidRPr="00000000">
@@ -14432,7 +14432,7 @@
           <ns0:szCs ns0:val="18"/>
           <ns0:color ns0:val="000000"/>
         </ns0:rPr>
-        <ns0:t xml:space="preserve">[13] Willard, B. T. ve Louf, R. (2023). Efficient guided generation for large language models (arXiv:2307.09702). arXiv. https://doi.org/10.48550/arXiv.2307.09702</ns0:t>
+        <ns0:t>[13] Willard, B. T. ve Louf, R. (2023). Efficient guided generation for large language models (arXiv:2307.09702). arXiv. url: https://doi.org/10.48550/arXiv.2307.09702</ns0:t>
       </ns0:r>
     </ns0:p>
     <ns0:p ns0:rsidR="00000000" ns0:rsidDel="00000000" ns0:rsidP="00000000" ns0:rsidRDefault="00000000" ns0:rsidRPr="00000000">
@@ -14463,7 +14463,7 @@
           <ns0:szCs ns0:val="18"/>
           <ns0:color ns0:val="000000"/>
         </ns0:rPr>
-        <ns0:t xml:space="preserve">[14] Chen, L., Zaharia, M. ve Zou, J. (2024). FrugalGPT: How to use large language models while reducing cost and improving performance. Transactions on Machine Learning Research. https://openreview.net/forum?id=cSimKw5p6R</ns0:t>
+        <ns0:t>[14] Chen, L., Zaharia, M. ve Zou, J. (2024). FrugalGPT: How to use large language models while reducing cost and improving performance. Transactions on Machine Learning Research. url: https://openreview.net/forum?id=cSimKw5p6R</ns0:t>
       </ns0:r>
     </ns0:p>
     <ns0:p ns0:rsidR="00000000" ns0:rsidDel="00000000" ns0:rsidP="00000000" ns0:rsidRDefault="00000000" ns0:rsidRPr="00000000">
@@ -14494,7 +14494,7 @@
           <ns0:szCs ns0:val="18"/>
           <ns0:color ns0:val="000000"/>
         </ns0:rPr>
-        <ns0:t xml:space="preserve">[15] Kumaran, V., Rowe, J., Mott, B. ve Lester, J. (2023). SceneCraft: Automating interactive narrative scene generation in digital games with large language models. Proceedings of the AAAI Conference on Artificial Intelligence and Interactive Digital Entertainment, 19(1), 86–96. https://doi.org/10.1609/aiide.v19i1.27504</ns0:t>
+        <ns0:t>[15] Kumaran, V., Rowe, J., Mott, B. ve Lester, J. (2023). SceneCraft: Automating interactive narrative scene generation in digital games with large language models. Proceedings of the AAAI Conference on Artificial Intelligence and Interactive Digital Entertainment, 19(1), 86–96. url: https://doi.org/10.1609/aiide.v19i1.27504</ns0:t>
       </ns0:r>
     </ns0:p>
     <ns0:p ns0:rsidR="00000000" ns0:rsidDel="00000000" ns0:rsidP="00000000" ns0:rsidRDefault="00000000" ns0:rsidRPr="00000000">
@@ -14525,7 +14525,7 @@
           <ns0:szCs ns0:val="18"/>
           <ns0:color ns0:val="000000"/>
         </ns0:rPr>
-        <ns0:t xml:space="preserve">[16] T.C. Cumhurbaşkanlığı Strateji ve Bütçe Başkanlığı. (2023). On İkinci Kalkınma Planı (2024–2028) (Türkiye Büyük Millet Meclisi Karar No. 1396; Resmî Gazete, 1 Kasım 2023, Mükerrer Sayı 32356). https://www.sbb.gov.tr/wp-content/uploads/2023/12/On-Ikinci-Kalkinma-Plani_2024-2028_11122023.pdf</ns0:t>
+        <ns0:t>[16] T.C. Cumhurbaşkanlığı Strateji ve Bütçe Başkanlığı. (2023). On İkinci Kalkınma Planı (2024–2028) (Türkiye Büyük Millet Meclisi Karar No. 1396; Resmî Gazete, 1 Kasım 2023, Mükerrer Sayı 32356). Son erişim tarihi: 30 Ekim 2026, url: https://www.sbb.gov.tr/wp-content/uploads/2023/12/On-Ikinci-Kalkinma-Plani_2024-2028_11122023.pdf</ns0:t>
       </ns0:r>
     </ns0:p>
     <ns0:p ns0:rsidR="00000000" ns0:rsidDel="00000000" ns0:rsidP="00000000" ns0:rsidRDefault="00000000" ns0:rsidRPr="00000000">
@@ -14556,7 +14556,7 @@
           <ns0:szCs ns0:val="18"/>
           <ns0:color ns0:val="000000"/>
         </ns0:rPr>
-        <ns0:t xml:space="preserve">[17] T.C. Cumhurbaşkanlığı. (2025). 2030 Sanayi ve Teknoloji Stratejisi ile ilgili 2025/6 sayılı Cumhurbaşkanlığı Genelgesi. Resmî Gazete, 10 Mayıs 2025, Sayı 32896.</ns0:t>
+        <ns0:t>[17] T.C. Cumhurbaşkanlığı. (2025). 2030 Sanayi ve Teknoloji Stratejisi ile ilgili 2025/6 sayılı Cumhurbaşkanlığı Genelgesi. Resmî Gazete, 10 Mayıs 2025, Sayı 32896. Son erişim tarihi: 30 Ekim 2026, url: https://www.resmigazete.gov.tr/eskiler/2025/05/20250510-4.pdf</ns0:t>
       </ns0:r>
     </ns0:p>
     <ns0:p ns0:rsidR="00000000" ns0:rsidDel="00000000" ns0:rsidP="00000000" ns0:rsidRDefault="00000000" ns0:rsidRPr="00000000" ns1:paraId="D3372E3E">

</xml_diff>

<commit_message>
docs: add official 2209-A cover page to proposal form
Co-authored-by: Cursor <cursoragent@cursor.com>
</commit_message>
<xml_diff>
--- a/docs/2209-A_Arastirma_Onerisi.docx
+++ b/docs/2209-A_Arastirma_Onerisi.docx
@@ -2,6 +2,1031 @@
 <file path=word/document.xml><?xml version="1.0" encoding="utf-8"?>
 <ns0:document xmlns:ns0="http://schemas.openxmlformats.org/wordprocessingml/2006/main" xmlns:ns1="http://schemas.microsoft.com/office/word/2010/wordml" xmlns:ns2="http://schemas.openxmlformats.org/officeDocument/2006/relationships">
   <ns0:body>
+    <w:p xmlns:w="http://schemas.openxmlformats.org/wordprocessingml/2006/main" xmlns:wp="http://schemas.openxmlformats.org/drawingml/2006/wordprocessingDrawing" xmlns:a="http://schemas.openxmlformats.org/drawingml/2006/main" xmlns:pic="http://schemas.openxmlformats.org/drawingml/2006/picture" xmlns:r="http://schemas.openxmlformats.org/officeDocument/2006/relationships">
+      <w:pPr>
+        <w:ind w:right="-4"/>
+        <w:rPr>
+          <w:rFonts w:ascii="Arial" w:cs="Arial" w:eastAsia="Arial" w:hAnsi="Arial"/>
+        </w:rPr>
+      </w:pPr>
+      <w:r>
+        <w:rPr>
+          <w:rtl w:val="0"/>
+        </w:rPr>
+      </w:r>
+    </w:p>
+    <w:p xmlns:w="http://schemas.openxmlformats.org/wordprocessingml/2006/main" xmlns:wp="http://schemas.openxmlformats.org/drawingml/2006/wordprocessingDrawing" xmlns:a="http://schemas.openxmlformats.org/drawingml/2006/main" xmlns:pic="http://schemas.openxmlformats.org/drawingml/2006/picture" xmlns:r="http://schemas.openxmlformats.org/officeDocument/2006/relationships">
+      <w:pPr>
+        <w:ind w:right="-4"/>
+        <w:rPr>
+          <w:rFonts w:ascii="Arial" w:cs="Arial" w:eastAsia="Arial" w:hAnsi="Arial"/>
+        </w:rPr>
+      </w:pPr>
+      <w:r>
+        <w:rPr>
+          <w:rtl w:val="0"/>
+        </w:rPr>
+      </w:r>
+    </w:p>
+    <w:p xmlns:w="http://schemas.openxmlformats.org/wordprocessingml/2006/main" xmlns:wp="http://schemas.openxmlformats.org/drawingml/2006/wordprocessingDrawing" xmlns:a="http://schemas.openxmlformats.org/drawingml/2006/main" xmlns:pic="http://schemas.openxmlformats.org/drawingml/2006/picture" xmlns:r="http://schemas.openxmlformats.org/officeDocument/2006/relationships">
+      <w:pPr>
+        <w:ind w:right="-4"/>
+        <w:rPr>
+          <w:rFonts w:ascii="Arial" w:cs="Arial" w:eastAsia="Arial" w:hAnsi="Arial"/>
+        </w:rPr>
+      </w:pPr>
+      <w:r>
+        <w:rPr>
+          <w:rtl w:val="0"/>
+        </w:rPr>
+      </w:r>
+    </w:p>
+    <w:p xmlns:w="http://schemas.openxmlformats.org/wordprocessingml/2006/main" xmlns:wp="http://schemas.openxmlformats.org/drawingml/2006/wordprocessingDrawing" xmlns:a="http://schemas.openxmlformats.org/drawingml/2006/main" xmlns:pic="http://schemas.openxmlformats.org/drawingml/2006/picture" xmlns:r="http://schemas.openxmlformats.org/officeDocument/2006/relationships">
+      <w:pPr>
+        <w:ind w:right="-4"/>
+        <w:rPr>
+          <w:rFonts w:ascii="Arial" w:cs="Arial" w:eastAsia="Arial" w:hAnsi="Arial"/>
+        </w:rPr>
+      </w:pPr>
+      <w:r>
+        <w:rPr>
+          <w:rtl w:val="0"/>
+        </w:rPr>
+      </w:r>
+      <w:r>
+        <w:drawing>
+          <wp:anchor allowOverlap="1" behindDoc="0" distB="0" distT="0" distL="0" distR="0" hidden="0" layoutInCell="1" locked="0" relativeHeight="0" simplePos="0">
+            <wp:simplePos x="0" y="0"/>
+            <wp:positionH relativeFrom="column">
+              <wp:posOffset>2478405</wp:posOffset>
+            </wp:positionH>
+            <wp:positionV relativeFrom="paragraph">
+              <wp:posOffset>93980</wp:posOffset>
+            </wp:positionV>
+            <wp:extent cx="957580" cy="1274445"/>
+            <wp:effectExtent b="0" l="0" r="0" t="0"/>
+            <wp:wrapNone/>
+            <wp:docPr descr="logo" id="10" name="image1.jpg"/>
+            <a:graphic>
+              <a:graphicData uri="http://schemas.openxmlformats.org/drawingml/2006/picture">
+                <pic:pic>
+                  <pic:nvPicPr>
+                    <pic:cNvPr descr="logo" id="0" name="image1.jpg"/>
+                    <pic:cNvPicPr preferRelativeResize="0"/>
+                  </pic:nvPicPr>
+                  <pic:blipFill>
+                    <a:blip r:embed="rIdCover1"/>
+                    <a:srcRect b="0" l="0" r="0" t="0"/>
+                    <a:stretch>
+                      <a:fillRect/>
+                    </a:stretch>
+                  </pic:blipFill>
+                  <pic:spPr>
+                    <a:xfrm>
+                      <a:off x="0" y="0"/>
+                      <a:ext cx="957580" cy="1274445"/>
+                    </a:xfrm>
+                    <a:prstGeom prst="rect"/>
+                    <a:ln/>
+                  </pic:spPr>
+                </pic:pic>
+              </a:graphicData>
+            </a:graphic>
+          </wp:anchor>
+        </w:drawing>
+      </w:r>
+    </w:p>
+    <w:p xmlns:w="http://schemas.openxmlformats.org/wordprocessingml/2006/main" xmlns:wp="http://schemas.openxmlformats.org/drawingml/2006/wordprocessingDrawing" xmlns:a="http://schemas.openxmlformats.org/drawingml/2006/main" xmlns:pic="http://schemas.openxmlformats.org/drawingml/2006/picture" xmlns:r="http://schemas.openxmlformats.org/officeDocument/2006/relationships">
+      <w:pPr>
+        <w:spacing w:line="388" w:lineRule="auto"/>
+        <w:ind w:left="774" w:right="882" w:firstLine="0"/>
+        <w:jc w:val="center"/>
+        <w:rPr>
+          <w:rFonts w:ascii="Arial" w:cs="Arial" w:eastAsia="Arial" w:hAnsi="Arial"/>
+          <w:color w:val="28386b"/>
+          <w:sz w:val="36"/>
+          <w:szCs w:val="36"/>
+        </w:rPr>
+      </w:pPr>
+      <w:r>
+        <w:rPr>
+          <w:rtl w:val="0"/>
+        </w:rPr>
+      </w:r>
+    </w:p>
+    <w:p xmlns:w="http://schemas.openxmlformats.org/wordprocessingml/2006/main" xmlns:wp="http://schemas.openxmlformats.org/drawingml/2006/wordprocessingDrawing" xmlns:a="http://schemas.openxmlformats.org/drawingml/2006/main" xmlns:pic="http://schemas.openxmlformats.org/drawingml/2006/picture" xmlns:r="http://schemas.openxmlformats.org/officeDocument/2006/relationships">
+      <w:pPr>
+        <w:spacing w:line="388" w:lineRule="auto"/>
+        <w:ind w:left="774" w:right="882" w:firstLine="0"/>
+        <w:jc w:val="center"/>
+        <w:rPr>
+          <w:rFonts w:ascii="Arial" w:cs="Arial" w:eastAsia="Arial" w:hAnsi="Arial"/>
+          <w:color w:val="28386b"/>
+          <w:sz w:val="36"/>
+          <w:szCs w:val="36"/>
+        </w:rPr>
+      </w:pPr>
+      <w:r>
+        <w:rPr>
+          <w:rtl w:val="0"/>
+        </w:rPr>
+      </w:r>
+    </w:p>
+    <w:p xmlns:w="http://schemas.openxmlformats.org/wordprocessingml/2006/main" xmlns:wp="http://schemas.openxmlformats.org/drawingml/2006/wordprocessingDrawing" xmlns:a="http://schemas.openxmlformats.org/drawingml/2006/main" xmlns:pic="http://schemas.openxmlformats.org/drawingml/2006/picture" xmlns:r="http://schemas.openxmlformats.org/officeDocument/2006/relationships">
+      <w:pPr>
+        <w:spacing w:line="388" w:lineRule="auto"/>
+        <w:ind w:left="774" w:right="882" w:firstLine="0"/>
+        <w:jc w:val="center"/>
+        <w:rPr>
+          <w:rFonts w:ascii="Arial" w:cs="Arial" w:eastAsia="Arial" w:hAnsi="Arial"/>
+          <w:color w:val="28386b"/>
+          <w:sz w:val="36"/>
+          <w:szCs w:val="36"/>
+        </w:rPr>
+      </w:pPr>
+      <w:r>
+        <w:rPr>
+          <w:rtl w:val="0"/>
+        </w:rPr>
+      </w:r>
+    </w:p>
+    <w:p xmlns:w="http://schemas.openxmlformats.org/wordprocessingml/2006/main" xmlns:wp="http://schemas.openxmlformats.org/drawingml/2006/wordprocessingDrawing" xmlns:a="http://schemas.openxmlformats.org/drawingml/2006/main" xmlns:pic="http://schemas.openxmlformats.org/drawingml/2006/picture" xmlns:r="http://schemas.openxmlformats.org/officeDocument/2006/relationships">
+      <w:pPr>
+        <w:spacing w:line="388" w:lineRule="auto"/>
+        <w:ind w:left="774" w:right="882" w:firstLine="0"/>
+        <w:jc w:val="center"/>
+        <w:rPr>
+          <w:rFonts w:ascii="Arial" w:cs="Arial" w:eastAsia="Arial" w:hAnsi="Arial"/>
+          <w:color w:val="28386b"/>
+          <w:sz w:val="36"/>
+          <w:szCs w:val="36"/>
+        </w:rPr>
+      </w:pPr>
+      <w:r>
+        <w:rPr>
+          <w:rtl w:val="0"/>
+        </w:rPr>
+      </w:r>
+    </w:p>
+    <w:p xmlns:w="http://schemas.openxmlformats.org/wordprocessingml/2006/main" xmlns:wp="http://schemas.openxmlformats.org/drawingml/2006/wordprocessingDrawing" xmlns:a="http://schemas.openxmlformats.org/drawingml/2006/main" xmlns:pic="http://schemas.openxmlformats.org/drawingml/2006/picture" xmlns:r="http://schemas.openxmlformats.org/officeDocument/2006/relationships">
+      <w:pPr>
+        <w:ind w:right="-4"/>
+        <w:rPr>
+          <w:rFonts w:ascii="Arial" w:cs="Arial" w:eastAsia="Arial" w:hAnsi="Arial"/>
+        </w:rPr>
+      </w:pPr>
+      <w:r>
+        <w:rPr>
+          <w:rtl w:val="0"/>
+        </w:rPr>
+      </w:r>
+    </w:p>
+    <w:p xmlns:w="http://schemas.openxmlformats.org/wordprocessingml/2006/main" xmlns:wp="http://schemas.openxmlformats.org/drawingml/2006/wordprocessingDrawing" xmlns:a="http://schemas.openxmlformats.org/drawingml/2006/main" xmlns:pic="http://schemas.openxmlformats.org/drawingml/2006/picture" xmlns:r="http://schemas.openxmlformats.org/officeDocument/2006/relationships">
+      <w:pPr>
+        <w:spacing w:line="388" w:lineRule="auto"/>
+        <w:ind w:left="774" w:right="882" w:firstLine="0"/>
+        <w:jc w:val="center"/>
+        <w:rPr>
+          <w:rFonts w:ascii="Arial" w:cs="Arial" w:eastAsia="Arial" w:hAnsi="Arial"/>
+          <w:color w:val="28386b"/>
+          <w:sz w:val="36"/>
+          <w:szCs w:val="36"/>
+        </w:rPr>
+      </w:pPr>
+      <w:r>
+        <w:rPr>
+          <w:rtl w:val="0"/>
+        </w:rPr>
+      </w:r>
+    </w:p>
+    <w:p xmlns:w="http://schemas.openxmlformats.org/wordprocessingml/2006/main" xmlns:wp="http://schemas.openxmlformats.org/drawingml/2006/wordprocessingDrawing" xmlns:a="http://schemas.openxmlformats.org/drawingml/2006/main" xmlns:pic="http://schemas.openxmlformats.org/drawingml/2006/picture" xmlns:r="http://schemas.openxmlformats.org/officeDocument/2006/relationships">
+      <w:pPr>
+        <w:spacing w:line="388" w:lineRule="auto"/>
+        <w:ind w:left="774" w:right="882" w:firstLine="0"/>
+        <w:jc w:val="center"/>
+        <w:rPr>
+          <w:rFonts w:ascii="Arial" w:cs="Arial" w:eastAsia="Arial" w:hAnsi="Arial"/>
+          <w:color w:val="28386b"/>
+          <w:sz w:val="36"/>
+          <w:szCs w:val="36"/>
+        </w:rPr>
+      </w:pPr>
+      <w:r>
+        <w:rPr>
+          <w:rtl w:val="0"/>
+        </w:rPr>
+      </w:r>
+    </w:p>
+    <w:p xmlns:w="http://schemas.openxmlformats.org/wordprocessingml/2006/main" xmlns:wp="http://schemas.openxmlformats.org/drawingml/2006/wordprocessingDrawing" xmlns:a="http://schemas.openxmlformats.org/drawingml/2006/main" xmlns:pic="http://schemas.openxmlformats.org/drawingml/2006/picture" xmlns:r="http://schemas.openxmlformats.org/officeDocument/2006/relationships">
+      <w:pPr>
+        <w:spacing w:line="388" w:lineRule="auto"/>
+        <w:ind w:left="774" w:right="882" w:firstLine="0"/>
+        <w:jc w:val="center"/>
+        <w:rPr>
+          <w:rFonts w:ascii="Arial" w:cs="Arial" w:eastAsia="Arial" w:hAnsi="Arial"/>
+          <w:color w:val="28386b"/>
+          <w:sz w:val="36"/>
+          <w:szCs w:val="36"/>
+        </w:rPr>
+      </w:pPr>
+      <w:r>
+        <w:rPr>
+          <w:rtl w:val="0"/>
+        </w:rPr>
+      </w:r>
+    </w:p>
+    <w:p xmlns:w="http://schemas.openxmlformats.org/wordprocessingml/2006/main" xmlns:wp="http://schemas.openxmlformats.org/drawingml/2006/wordprocessingDrawing" xmlns:a="http://schemas.openxmlformats.org/drawingml/2006/main" xmlns:pic="http://schemas.openxmlformats.org/drawingml/2006/picture" xmlns:r="http://schemas.openxmlformats.org/officeDocument/2006/relationships">
+      <w:pPr>
+        <w:spacing w:line="388" w:lineRule="auto"/>
+        <w:ind w:left="774" w:right="882" w:firstLine="0"/>
+        <w:jc w:val="center"/>
+        <w:rPr>
+          <w:rFonts w:ascii="Arial" w:cs="Arial" w:eastAsia="Arial" w:hAnsi="Arial"/>
+          <w:color w:val="28386b"/>
+          <w:sz w:val="36"/>
+          <w:szCs w:val="36"/>
+        </w:rPr>
+      </w:pPr>
+      <w:r>
+        <w:rPr>
+          <w:rtl w:val="0"/>
+        </w:rPr>
+      </w:r>
+    </w:p>
+    <w:p xmlns:w="http://schemas.openxmlformats.org/wordprocessingml/2006/main" xmlns:wp="http://schemas.openxmlformats.org/drawingml/2006/wordprocessingDrawing" xmlns:a="http://schemas.openxmlformats.org/drawingml/2006/main" xmlns:pic="http://schemas.openxmlformats.org/drawingml/2006/picture" xmlns:r="http://schemas.openxmlformats.org/officeDocument/2006/relationships">
+      <w:pPr>
+        <w:ind w:right="-4"/>
+        <w:jc w:val="center"/>
+        <w:rPr>
+          <w:rFonts w:ascii="Arial" w:cs="Arial" w:eastAsia="Arial" w:hAnsi="Arial"/>
+        </w:rPr>
+      </w:pPr>
+      <w:r>
+        <w:rPr>
+          <w:rtl w:val="0"/>
+        </w:rPr>
+      </w:r>
+    </w:p>
+    <w:p xmlns:w="http://schemas.openxmlformats.org/wordprocessingml/2006/main" xmlns:wp="http://schemas.openxmlformats.org/drawingml/2006/wordprocessingDrawing" xmlns:a="http://schemas.openxmlformats.org/drawingml/2006/main" xmlns:pic="http://schemas.openxmlformats.org/drawingml/2006/picture" xmlns:r="http://schemas.openxmlformats.org/officeDocument/2006/relationships">
+      <w:pPr>
+        <w:ind w:right="-4"/>
+        <w:jc w:val="center"/>
+        <w:rPr>
+          <w:rFonts w:ascii="Arial" w:cs="Arial" w:eastAsia="Arial" w:hAnsi="Arial"/>
+        </w:rPr>
+      </w:pPr>
+      <w:r>
+        <w:rPr>
+          <w:rtl w:val="0"/>
+        </w:rPr>
+      </w:r>
+    </w:p>
+    <w:p xmlns:w="http://schemas.openxmlformats.org/wordprocessingml/2006/main" xmlns:wp="http://schemas.openxmlformats.org/drawingml/2006/wordprocessingDrawing" xmlns:a="http://schemas.openxmlformats.org/drawingml/2006/main" xmlns:pic="http://schemas.openxmlformats.org/drawingml/2006/picture" xmlns:r="http://schemas.openxmlformats.org/officeDocument/2006/relationships">
+      <w:pPr>
+        <w:keepNext w:val="0"/>
+        <w:keepLines w:val="0"/>
+        <w:pageBreakBefore w:val="0"/>
+        <w:widowControl w:val="0"/>
+        <w:pBdr>
+          <w:top w:space="0" w:sz="0" w:val="nil"/>
+          <w:left w:space="0" w:sz="0" w:val="nil"/>
+          <w:bottom w:space="0" w:sz="0" w:val="nil"/>
+          <w:right w:space="0" w:sz="0" w:val="nil"/>
+          <w:between w:space="0" w:sz="0" w:val="nil"/>
+        </w:pBdr>
+        <w:shd w:fill="auto" w:val="clear"/>
+        <w:spacing w:after="0" w:before="0" w:line="240" w:lineRule="auto"/>
+        <w:ind w:left="0" w:right="565" w:firstLine="0"/>
+        <w:jc w:val="center"/>
+        <w:rPr>
+          <w:rFonts w:ascii="Arial" w:cs="Arial" w:eastAsia="Arial" w:hAnsi="Arial"/>
+          <w:b w:val="1"/>
+          <w:bCs w:val="1"/>
+          <w:i w:val="0"/>
+          <w:iCs w:val="0"/>
+          <w:smallCaps w:val="0"/>
+          <w:strike w:val="0"/>
+          <w:color w:val="000000"/>
+          <w:sz w:val="28"/>
+          <w:szCs w:val="28"/>
+          <w:u w:val="none"/>
+          <w:shd w:fill="auto" w:val="clear"/>
+          <w:vertAlign w:val="baseline"/>
+        </w:rPr>
+      </w:pPr>
+      <w:r>
+        <w:rPr>
+          <w:rFonts w:ascii="Arial" w:cs="Arial" w:eastAsia="Arial" w:hAnsi="Arial"/>
+          <w:b w:val="1"/>
+          <w:bCs w:val="1"/>
+          <w:i w:val="0"/>
+          <w:iCs w:val="0"/>
+          <w:smallCaps w:val="0"/>
+          <w:strike w:val="0"/>
+          <w:color w:val="000000"/>
+          <w:sz w:val="28"/>
+          <w:szCs w:val="28"/>
+          <w:u w:val="none"/>
+          <w:shd w:fill="auto" w:val="clear"/>
+          <w:vertAlign w:val="baseline"/>
+          <w:rtl w:val="0"/>
+        </w:rPr>
+        <w:t xml:space="preserve">TÜBİTAK 2209-A ÜNİVERSİTE ÖĞRENCİLERİ ARAŞTIRMA PROJELERİ DESTEKLEME PROGRAMI</w:t>
+      </w:r>
+    </w:p>
+    <w:p xmlns:w="http://schemas.openxmlformats.org/wordprocessingml/2006/main" xmlns:wp="http://schemas.openxmlformats.org/drawingml/2006/wordprocessingDrawing" xmlns:a="http://schemas.openxmlformats.org/drawingml/2006/main" xmlns:pic="http://schemas.openxmlformats.org/drawingml/2006/picture" xmlns:r="http://schemas.openxmlformats.org/officeDocument/2006/relationships">
+      <w:pPr>
+        <w:keepNext w:val="0"/>
+        <w:keepLines w:val="0"/>
+        <w:pageBreakBefore w:val="0"/>
+        <w:widowControl w:val="0"/>
+        <w:pBdr>
+          <w:top w:space="0" w:sz="0" w:val="nil"/>
+          <w:left w:space="0" w:sz="0" w:val="nil"/>
+          <w:bottom w:space="0" w:sz="0" w:val="nil"/>
+          <w:right w:space="0" w:sz="0" w:val="nil"/>
+          <w:between w:space="0" w:sz="0" w:val="nil"/>
+        </w:pBdr>
+        <w:shd w:fill="auto" w:val="clear"/>
+        <w:spacing w:after="0" w:before="0" w:line="240" w:lineRule="auto"/>
+        <w:ind w:left="0" w:right="565" w:firstLine="0"/>
+        <w:jc w:val="center"/>
+        <w:rPr>
+          <w:rFonts w:ascii="Arial" w:cs="Arial" w:eastAsia="Arial" w:hAnsi="Arial"/>
+          <w:b w:val="1"/>
+          <w:bCs w:val="1"/>
+          <w:i w:val="0"/>
+          <w:iCs w:val="0"/>
+          <w:smallCaps w:val="0"/>
+          <w:strike w:val="0"/>
+          <w:color w:val="000000"/>
+          <w:sz w:val="28"/>
+          <w:szCs w:val="28"/>
+          <w:u w:val="none"/>
+          <w:shd w:fill="auto" w:val="clear"/>
+          <w:vertAlign w:val="baseline"/>
+        </w:rPr>
+      </w:pPr>
+      <w:r>
+        <w:rPr>
+          <w:rtl w:val="0"/>
+        </w:rPr>
+      </w:r>
+    </w:p>
+    <w:p xmlns:w="http://schemas.openxmlformats.org/wordprocessingml/2006/main" xmlns:wp="http://schemas.openxmlformats.org/drawingml/2006/wordprocessingDrawing" xmlns:a="http://schemas.openxmlformats.org/drawingml/2006/main" xmlns:pic="http://schemas.openxmlformats.org/drawingml/2006/picture" xmlns:r="http://schemas.openxmlformats.org/officeDocument/2006/relationships">
+      <w:pPr>
+        <w:keepNext w:val="0"/>
+        <w:keepLines w:val="0"/>
+        <w:pageBreakBefore w:val="0"/>
+        <w:widowControl w:val="1"/>
+        <w:pBdr>
+          <w:top w:space="0" w:sz="0" w:val="nil"/>
+          <w:left w:space="0" w:sz="0" w:val="nil"/>
+          <w:bottom w:space="0" w:sz="0" w:val="nil"/>
+          <w:right w:space="0" w:sz="0" w:val="nil"/>
+          <w:between w:space="0" w:sz="0" w:val="nil"/>
+        </w:pBdr>
+        <w:shd w:fill="auto" w:val="clear"/>
+        <w:spacing w:after="0" w:before="0" w:line="240" w:lineRule="auto"/>
+        <w:ind w:left="0" w:right="0" w:firstLine="0"/>
+        <w:jc w:val="center"/>
+        <w:rPr>
+          <w:rFonts w:ascii="Arial" w:cs="Arial" w:eastAsia="Arial" w:hAnsi="Arial"/>
+          <w:b w:val="1"/>
+          <w:bCs w:val="1"/>
+          <w:i w:val="0"/>
+          <w:iCs w:val="0"/>
+          <w:smallCaps w:val="0"/>
+          <w:strike w:val="0"/>
+          <w:color w:val="ff0000"/>
+          <w:sz w:val="16"/>
+          <w:szCs w:val="16"/>
+          <w:u w:val="none"/>
+          <w:shd w:fill="auto" w:val="clear"/>
+          <w:vertAlign w:val="baseline"/>
+        </w:rPr>
+      </w:pPr>
+      <w:r>
+        <w:rPr>
+          <w:rFonts w:ascii="Arial" w:cs="Arial" w:eastAsia="Arial" w:hAnsi="Arial"/>
+          <w:b w:val="1"/>
+          <w:bCs w:val="1"/>
+          <w:i w:val="0"/>
+          <w:iCs w:val="0"/>
+          <w:smallCaps w:val="0"/>
+          <w:strike w:val="0"/>
+          <w:color w:val="ff0000"/>
+          <w:sz w:val="18"/>
+          <w:szCs w:val="18"/>
+          <w:u w:val="none"/>
+          <w:shd w:fill="auto" w:val="clear"/>
+          <w:vertAlign w:val="baseline"/>
+          <w:rtl w:val="0"/>
+        </w:rPr>
+        <w:t xml:space="preserve">Başvuru formunun Arial 9 yazı tipinde, her bir konu başlığı altında verilen açıklamalar göz önünde bulundurularak hazırlanması ve ekler hariç toplam 20 sayfayı geçmemesi beklenir (Alt sınır bulunmamaktadır). Değerlendirme araştırma önerisinin bilimsel niteliği, yöntemi, proje yönetimi ve yaygın etkisi başlıkları üzerinden yapılacaktır.</w:t>
+      </w:r>
+      <w:r>
+        <w:rPr>
+          <w:rtl w:val="0"/>
+        </w:rPr>
+      </w:r>
+    </w:p>
+    <w:p xmlns:w="http://schemas.openxmlformats.org/wordprocessingml/2006/main" xmlns:wp="http://schemas.openxmlformats.org/drawingml/2006/wordprocessingDrawing" xmlns:a="http://schemas.openxmlformats.org/drawingml/2006/main" xmlns:pic="http://schemas.openxmlformats.org/drawingml/2006/picture" xmlns:r="http://schemas.openxmlformats.org/officeDocument/2006/relationships">
+      <w:pPr>
+        <w:keepNext w:val="0"/>
+        <w:keepLines w:val="0"/>
+        <w:pageBreakBefore w:val="0"/>
+        <w:widowControl w:val="0"/>
+        <w:pBdr>
+          <w:top w:space="0" w:sz="0" w:val="nil"/>
+          <w:left w:space="0" w:sz="0" w:val="nil"/>
+          <w:bottom w:space="0" w:sz="0" w:val="nil"/>
+          <w:right w:space="0" w:sz="0" w:val="nil"/>
+          <w:between w:space="0" w:sz="0" w:val="nil"/>
+        </w:pBdr>
+        <w:shd w:fill="auto" w:val="clear"/>
+        <w:spacing w:after="0" w:before="0" w:line="240" w:lineRule="auto"/>
+        <w:ind w:left="0" w:right="565" w:firstLine="0"/>
+        <w:jc w:val="center"/>
+        <w:rPr>
+          <w:rFonts w:ascii="Arial" w:cs="Arial" w:eastAsia="Arial" w:hAnsi="Arial"/>
+          <w:b w:val="1"/>
+          <w:bCs w:val="1"/>
+          <w:i w:val="0"/>
+          <w:iCs w:val="0"/>
+          <w:smallCaps w:val="0"/>
+          <w:strike w:val="0"/>
+          <w:color w:val="000000"/>
+          <w:sz w:val="28"/>
+          <w:szCs w:val="28"/>
+          <w:u w:val="none"/>
+          <w:shd w:fill="auto" w:val="clear"/>
+          <w:vertAlign w:val="baseline"/>
+        </w:rPr>
+      </w:pPr>
+      <w:r>
+        <w:rPr>
+          <w:rtl w:val="0"/>
+        </w:rPr>
+      </w:r>
+    </w:p>
+    <w:p xmlns:w="http://schemas.openxmlformats.org/wordprocessingml/2006/main" xmlns:wp="http://schemas.openxmlformats.org/drawingml/2006/wordprocessingDrawing" xmlns:a="http://schemas.openxmlformats.org/drawingml/2006/main" xmlns:pic="http://schemas.openxmlformats.org/drawingml/2006/picture" xmlns:r="http://schemas.openxmlformats.org/officeDocument/2006/relationships">
+      <w:pPr>
+        <w:keepNext w:val="0"/>
+        <w:keepLines w:val="0"/>
+        <w:pageBreakBefore w:val="0"/>
+        <w:widowControl w:val="0"/>
+        <w:pBdr>
+          <w:top w:space="0" w:sz="0" w:val="nil"/>
+          <w:left w:space="0" w:sz="0" w:val="nil"/>
+          <w:bottom w:space="0" w:sz="0" w:val="nil"/>
+          <w:right w:space="0" w:sz="0" w:val="nil"/>
+          <w:between w:space="0" w:sz="0" w:val="nil"/>
+        </w:pBdr>
+        <w:shd w:fill="auto" w:val="clear"/>
+        <w:spacing w:after="0" w:before="0" w:line="240" w:lineRule="auto"/>
+        <w:ind w:left="0" w:right="565" w:firstLine="0"/>
+        <w:jc w:val="center"/>
+        <w:rPr>
+          <w:rFonts w:ascii="Arial" w:cs="Arial" w:eastAsia="Arial" w:hAnsi="Arial"/>
+          <w:b w:val="1"/>
+          <w:bCs w:val="1"/>
+          <w:i w:val="0"/>
+          <w:iCs w:val="0"/>
+          <w:smallCaps w:val="0"/>
+          <w:strike w:val="0"/>
+          <w:color w:val="000000"/>
+          <w:sz w:val="28"/>
+          <w:szCs w:val="28"/>
+          <w:u w:val="none"/>
+          <w:shd w:fill="auto" w:val="clear"/>
+          <w:vertAlign w:val="baseline"/>
+        </w:rPr>
+      </w:pPr>
+      <w:r>
+        <w:rPr>
+          <w:rFonts w:ascii="Arial" w:cs="Arial" w:eastAsia="Arial" w:hAnsi="Arial"/>
+          <w:b w:val="1"/>
+          <w:bCs w:val="1"/>
+          <w:i w:val="0"/>
+          <w:iCs w:val="0"/>
+          <w:smallCaps w:val="0"/>
+          <w:strike w:val="0"/>
+          <w:color w:val="000000"/>
+          <w:sz w:val="28"/>
+          <w:szCs w:val="28"/>
+          <w:u w:val="none"/>
+          <w:shd w:fill="auto" w:val="clear"/>
+          <w:vertAlign w:val="baseline"/>
+          <w:rtl w:val="0"/>
+        </w:rPr>
+        <w:t xml:space="preserve">ARAŞTIRMA ÖNERİSİ FORMU</w:t>
+      </w:r>
+    </w:p>
+    <w:p xmlns:w="http://schemas.openxmlformats.org/wordprocessingml/2006/main" xmlns:wp="http://schemas.openxmlformats.org/drawingml/2006/wordprocessingDrawing" xmlns:a="http://schemas.openxmlformats.org/drawingml/2006/main" xmlns:pic="http://schemas.openxmlformats.org/drawingml/2006/picture" xmlns:r="http://schemas.openxmlformats.org/officeDocument/2006/relationships">
+      <w:pPr>
+        <w:keepNext w:val="0"/>
+        <w:keepLines w:val="0"/>
+        <w:pageBreakBefore w:val="0"/>
+        <w:widowControl w:val="0"/>
+        <w:pBdr>
+          <w:top w:space="0" w:sz="0" w:val="nil"/>
+          <w:left w:space="0" w:sz="0" w:val="nil"/>
+          <w:bottom w:space="0" w:sz="0" w:val="nil"/>
+          <w:right w:space="0" w:sz="0" w:val="nil"/>
+          <w:between w:space="0" w:sz="0" w:val="nil"/>
+        </w:pBdr>
+        <w:shd w:fill="auto" w:val="clear"/>
+        <w:spacing w:after="0" w:before="0" w:line="240" w:lineRule="auto"/>
+        <w:ind w:left="0" w:right="565" w:firstLine="0"/>
+        <w:jc w:val="center"/>
+        <w:rPr>
+          <w:rFonts w:ascii="Arial" w:cs="Arial" w:eastAsia="Arial" w:hAnsi="Arial"/>
+          <w:b w:val="1"/>
+          <w:bCs w:val="1"/>
+          <w:i w:val="0"/>
+          <w:iCs w:val="0"/>
+          <w:smallCaps w:val="0"/>
+          <w:strike w:val="0"/>
+          <w:color w:val="000000"/>
+          <w:sz w:val="28"/>
+          <w:szCs w:val="28"/>
+          <w:u w:val="none"/>
+          <w:shd w:fill="auto" w:val="clear"/>
+          <w:vertAlign w:val="baseline"/>
+        </w:rPr>
+      </w:pPr>
+      <w:r>
+        <w:rPr>
+          <w:rtl w:val="0"/>
+        </w:rPr>
+      </w:r>
+    </w:p>
+    <w:p xmlns:w="http://schemas.openxmlformats.org/wordprocessingml/2006/main" xmlns:wp="http://schemas.openxmlformats.org/drawingml/2006/wordprocessingDrawing" xmlns:a="http://schemas.openxmlformats.org/drawingml/2006/main" xmlns:pic="http://schemas.openxmlformats.org/drawingml/2006/picture" xmlns:r="http://schemas.openxmlformats.org/officeDocument/2006/relationships">
+      <w:pPr>
+        <w:keepNext w:val="0"/>
+        <w:keepLines w:val="0"/>
+        <w:pageBreakBefore w:val="0"/>
+        <w:widowControl w:val="0"/>
+        <w:pBdr>
+          <w:top w:space="0" w:sz="0" w:val="nil"/>
+          <w:left w:space="0" w:sz="0" w:val="nil"/>
+          <w:bottom w:space="0" w:sz="0" w:val="nil"/>
+          <w:right w:space="0" w:sz="0" w:val="nil"/>
+          <w:between w:space="0" w:sz="0" w:val="nil"/>
+        </w:pBdr>
+        <w:shd w:fill="auto" w:val="clear"/>
+        <w:spacing w:after="0" w:before="0" w:line="240" w:lineRule="auto"/>
+        <w:ind w:left="0" w:right="565" w:firstLine="0"/>
+        <w:jc w:val="center"/>
+        <w:rPr>
+          <w:rFonts w:ascii="Arial" w:cs="Arial" w:eastAsia="Arial" w:hAnsi="Arial"/>
+          <w:b w:val="1"/>
+          <w:bCs w:val="1"/>
+          <w:i w:val="0"/>
+          <w:iCs w:val="0"/>
+          <w:smallCaps w:val="0"/>
+          <w:strike w:val="0"/>
+          <w:color w:val="000000"/>
+          <w:sz w:val="28"/>
+          <w:szCs w:val="28"/>
+          <w:u w:val="none"/>
+          <w:shd w:fill="auto" w:val="clear"/>
+          <w:vertAlign w:val="baseline"/>
+        </w:rPr>
+      </w:pPr>
+      <w:r>
+        <w:rPr>
+          <w:rtl w:val="0"/>
+        </w:rPr>
+      </w:r>
+    </w:p>
+    <w:p xmlns:w="http://schemas.openxmlformats.org/wordprocessingml/2006/main" xmlns:wp="http://schemas.openxmlformats.org/drawingml/2006/wordprocessingDrawing" xmlns:a="http://schemas.openxmlformats.org/drawingml/2006/main" xmlns:pic="http://schemas.openxmlformats.org/drawingml/2006/picture" xmlns:r="http://schemas.openxmlformats.org/officeDocument/2006/relationships">
+      <w:pPr>
+        <w:keepNext w:val="0"/>
+        <w:keepLines w:val="0"/>
+        <w:pageBreakBefore w:val="0"/>
+        <w:widowControl w:val="0"/>
+        <w:pBdr>
+          <w:top w:space="0" w:sz="0" w:val="nil"/>
+          <w:left w:space="0" w:sz="0" w:val="nil"/>
+          <w:bottom w:space="0" w:sz="0" w:val="nil"/>
+          <w:right w:space="0" w:sz="0" w:val="nil"/>
+          <w:between w:space="0" w:sz="0" w:val="nil"/>
+        </w:pBdr>
+        <w:shd w:fill="auto" w:val="clear"/>
+        <w:spacing w:after="0" w:before="0" w:line="240" w:lineRule="auto"/>
+        <w:ind w:left="0" w:right="565" w:firstLine="0"/>
+        <w:jc w:val="center"/>
+        <w:rPr>
+          <w:rFonts w:ascii="Arial" w:cs="Arial" w:eastAsia="Arial" w:hAnsi="Arial"/>
+          <w:b w:val="1"/>
+          <w:bCs w:val="1"/>
+          <w:i w:val="0"/>
+          <w:iCs w:val="0"/>
+          <w:smallCaps w:val="0"/>
+          <w:strike w:val="0"/>
+          <w:color w:val="000000"/>
+          <w:sz w:val="28"/>
+          <w:szCs w:val="28"/>
+          <w:u w:val="none"/>
+          <w:shd w:fill="auto" w:val="clear"/>
+          <w:vertAlign w:val="baseline"/>
+        </w:rPr>
+      </w:pPr>
+      <w:r>
+        <w:rPr>
+          <w:rtl w:val="0"/>
+        </w:rPr>
+      </w:r>
+    </w:p>
+    <w:p xmlns:w="http://schemas.openxmlformats.org/wordprocessingml/2006/main" xmlns:wp="http://schemas.openxmlformats.org/drawingml/2006/wordprocessingDrawing" xmlns:a="http://schemas.openxmlformats.org/drawingml/2006/main" xmlns:pic="http://schemas.openxmlformats.org/drawingml/2006/picture" xmlns:r="http://schemas.openxmlformats.org/officeDocument/2006/relationships">
+      <w:pPr>
+        <w:keepNext w:val="0"/>
+        <w:keepLines w:val="0"/>
+        <w:pageBreakBefore w:val="0"/>
+        <w:widowControl w:val="0"/>
+        <w:pBdr>
+          <w:top w:space="0" w:sz="0" w:val="nil"/>
+          <w:left w:space="0" w:sz="0" w:val="nil"/>
+          <w:bottom w:space="0" w:sz="0" w:val="nil"/>
+          <w:right w:space="0" w:sz="0" w:val="nil"/>
+          <w:between w:space="0" w:sz="0" w:val="nil"/>
+        </w:pBdr>
+        <w:shd w:fill="auto" w:val="clear"/>
+        <w:spacing w:after="0" w:before="0" w:line="240" w:lineRule="auto"/>
+        <w:ind w:left="0" w:right="565" w:firstLine="0"/>
+        <w:jc w:val="center"/>
+        <w:rPr>
+          <w:rFonts w:ascii="Arial" w:cs="Arial" w:eastAsia="Arial" w:hAnsi="Arial"/>
+          <w:b w:val="1"/>
+          <w:bCs w:val="1"/>
+          <w:i w:val="0"/>
+          <w:iCs w:val="0"/>
+          <w:smallCaps w:val="0"/>
+          <w:strike w:val="0"/>
+          <w:color w:val="000000"/>
+          <w:sz w:val="28"/>
+          <w:szCs w:val="28"/>
+          <w:u w:val="none"/>
+          <w:shd w:fill="auto" w:val="clear"/>
+          <w:vertAlign w:val="baseline"/>
+        </w:rPr>
+      </w:pPr>
+      <w:r>
+        <w:rPr>
+          <w:rtl w:val="0"/>
+        </w:rPr>
+      </w:r>
+    </w:p>
+    <w:p xmlns:w="http://schemas.openxmlformats.org/wordprocessingml/2006/main" xmlns:wp="http://schemas.openxmlformats.org/drawingml/2006/wordprocessingDrawing" xmlns:a="http://schemas.openxmlformats.org/drawingml/2006/main" xmlns:pic="http://schemas.openxmlformats.org/drawingml/2006/picture" xmlns:r="http://schemas.openxmlformats.org/officeDocument/2006/relationships">
+      <w:pPr>
+        <w:keepNext w:val="0"/>
+        <w:keepLines w:val="0"/>
+        <w:pageBreakBefore w:val="0"/>
+        <w:widowControl w:val="0"/>
+        <w:pBdr>
+          <w:top w:space="0" w:sz="0" w:val="nil"/>
+          <w:left w:space="0" w:sz="0" w:val="nil"/>
+          <w:bottom w:space="0" w:sz="0" w:val="nil"/>
+          <w:right w:space="0" w:sz="0" w:val="nil"/>
+          <w:between w:space="0" w:sz="0" w:val="nil"/>
+        </w:pBdr>
+        <w:shd w:fill="auto" w:val="clear"/>
+        <w:spacing w:after="0" w:before="0" w:line="240" w:lineRule="auto"/>
+        <w:ind w:left="0" w:right="565" w:firstLine="0"/>
+        <w:jc w:val="center"/>
+        <w:rPr>
+          <w:rFonts w:ascii="Arial" w:cs="Arial" w:eastAsia="Arial" w:hAnsi="Arial"/>
+          <w:b w:val="1"/>
+          <w:bCs w:val="1"/>
+          <w:i w:val="0"/>
+          <w:iCs w:val="0"/>
+          <w:smallCaps w:val="0"/>
+          <w:strike w:val="0"/>
+          <w:color w:val="000000"/>
+          <w:sz w:val="28"/>
+          <w:szCs w:val="28"/>
+          <w:u w:val="none"/>
+          <w:shd w:fill="auto" w:val="clear"/>
+          <w:vertAlign w:val="baseline"/>
+        </w:rPr>
+      </w:pPr>
+      <w:r>
+        <w:rPr>
+          <w:rtl w:val="0"/>
+        </w:rPr>
+      </w:r>
+    </w:p>
+    <w:p xmlns:w="http://schemas.openxmlformats.org/wordprocessingml/2006/main" xmlns:wp="http://schemas.openxmlformats.org/drawingml/2006/wordprocessingDrawing" xmlns:a="http://schemas.openxmlformats.org/drawingml/2006/main" xmlns:pic="http://schemas.openxmlformats.org/drawingml/2006/picture" xmlns:r="http://schemas.openxmlformats.org/officeDocument/2006/relationships">
+      <w:pPr>
+        <w:keepNext w:val="0"/>
+        <w:keepLines w:val="0"/>
+        <w:pageBreakBefore w:val="0"/>
+        <w:widowControl w:val="0"/>
+        <w:pBdr>
+          <w:top w:space="0" w:sz="0" w:val="nil"/>
+          <w:left w:space="0" w:sz="0" w:val="nil"/>
+          <w:bottom w:space="0" w:sz="0" w:val="nil"/>
+          <w:right w:space="0" w:sz="0" w:val="nil"/>
+          <w:between w:space="0" w:sz="0" w:val="nil"/>
+        </w:pBdr>
+        <w:shd w:fill="auto" w:val="clear"/>
+        <w:spacing w:after="0" w:before="0" w:line="240" w:lineRule="auto"/>
+        <w:ind w:left="0" w:right="565" w:firstLine="0"/>
+        <w:jc w:val="center"/>
+        <w:rPr>
+          <w:rFonts w:ascii="Arial" w:cs="Arial" w:eastAsia="Arial" w:hAnsi="Arial"/>
+          <w:b w:val="1"/>
+          <w:bCs w:val="1"/>
+          <w:i w:val="0"/>
+          <w:iCs w:val="0"/>
+          <w:smallCaps w:val="0"/>
+          <w:strike w:val="0"/>
+          <w:color w:val="000000"/>
+          <w:sz w:val="28"/>
+          <w:szCs w:val="28"/>
+          <w:u w:val="none"/>
+          <w:shd w:fill="auto" w:val="clear"/>
+          <w:vertAlign w:val="baseline"/>
+        </w:rPr>
+      </w:pPr>
+      <w:r>
+        <w:rPr>
+          <w:rtl w:val="0"/>
+        </w:rPr>
+      </w:r>
+    </w:p>
+    <w:p xmlns:w="http://schemas.openxmlformats.org/wordprocessingml/2006/main" xmlns:wp="http://schemas.openxmlformats.org/drawingml/2006/wordprocessingDrawing" xmlns:a="http://schemas.openxmlformats.org/drawingml/2006/main" xmlns:pic="http://schemas.openxmlformats.org/drawingml/2006/picture" xmlns:r="http://schemas.openxmlformats.org/officeDocument/2006/relationships">
+      <w:pPr>
+        <w:keepNext w:val="0"/>
+        <w:keepLines w:val="0"/>
+        <w:pageBreakBefore w:val="0"/>
+        <w:widowControl w:val="0"/>
+        <w:pBdr>
+          <w:top w:space="0" w:sz="0" w:val="nil"/>
+          <w:left w:space="0" w:sz="0" w:val="nil"/>
+          <w:bottom w:space="0" w:sz="0" w:val="nil"/>
+          <w:right w:space="0" w:sz="0" w:val="nil"/>
+          <w:between w:space="0" w:sz="0" w:val="nil"/>
+        </w:pBdr>
+        <w:shd w:fill="auto" w:val="clear"/>
+        <w:spacing w:after="0" w:before="0" w:line="240" w:lineRule="auto"/>
+        <w:ind w:left="0" w:right="565" w:firstLine="0"/>
+        <w:jc w:val="center"/>
+        <w:rPr>
+          <w:rFonts w:ascii="Arial" w:cs="Arial" w:eastAsia="Arial" w:hAnsi="Arial"/>
+          <w:b w:val="1"/>
+          <w:bCs w:val="1"/>
+          <w:i w:val="0"/>
+          <w:iCs w:val="0"/>
+          <w:smallCaps w:val="0"/>
+          <w:strike w:val="0"/>
+          <w:color w:val="000000"/>
+          <w:sz w:val="28"/>
+          <w:szCs w:val="28"/>
+          <w:u w:val="none"/>
+          <w:shd w:fill="auto" w:val="clear"/>
+          <w:vertAlign w:val="baseline"/>
+        </w:rPr>
+      </w:pPr>
+      <w:r>
+        <w:rPr>
+          <w:rtl w:val="0"/>
+        </w:rPr>
+      </w:r>
+    </w:p>
+    <w:p xmlns:w="http://schemas.openxmlformats.org/wordprocessingml/2006/main" xmlns:wp="http://schemas.openxmlformats.org/drawingml/2006/wordprocessingDrawing" xmlns:a="http://schemas.openxmlformats.org/drawingml/2006/main" xmlns:pic="http://schemas.openxmlformats.org/drawingml/2006/picture" xmlns:r="http://schemas.openxmlformats.org/officeDocument/2006/relationships">
+      <w:pPr>
+        <w:keepNext w:val="0"/>
+        <w:keepLines w:val="0"/>
+        <w:pageBreakBefore w:val="0"/>
+        <w:widowControl w:val="0"/>
+        <w:pBdr>
+          <w:top w:space="0" w:sz="0" w:val="nil"/>
+          <w:left w:space="0" w:sz="0" w:val="nil"/>
+          <w:bottom w:space="0" w:sz="0" w:val="nil"/>
+          <w:right w:space="0" w:sz="0" w:val="nil"/>
+          <w:between w:space="0" w:sz="0" w:val="nil"/>
+        </w:pBdr>
+        <w:shd w:fill="auto" w:val="clear"/>
+        <w:spacing w:after="0" w:before="0" w:line="240" w:lineRule="auto"/>
+        <w:ind w:left="0" w:right="565" w:firstLine="0"/>
+        <w:jc w:val="center"/>
+        <w:rPr>
+          <w:rFonts w:ascii="Arial" w:cs="Arial" w:eastAsia="Arial" w:hAnsi="Arial"/>
+          <w:b w:val="1"/>
+          <w:bCs w:val="1"/>
+          <w:i w:val="0"/>
+          <w:iCs w:val="0"/>
+          <w:smallCaps w:val="0"/>
+          <w:strike w:val="0"/>
+          <w:color w:val="000000"/>
+          <w:sz w:val="28"/>
+          <w:szCs w:val="28"/>
+          <w:u w:val="none"/>
+          <w:shd w:fill="auto" w:val="clear"/>
+          <w:vertAlign w:val="baseline"/>
+        </w:rPr>
+      </w:pPr>
+      <w:r>
+        <w:rPr>
+          <w:rtl w:val="0"/>
+        </w:rPr>
+      </w:r>
+    </w:p>
+    <w:p xmlns:w="http://schemas.openxmlformats.org/wordprocessingml/2006/main" xmlns:wp="http://schemas.openxmlformats.org/drawingml/2006/wordprocessingDrawing" xmlns:a="http://schemas.openxmlformats.org/drawingml/2006/main" xmlns:pic="http://schemas.openxmlformats.org/drawingml/2006/picture" xmlns:r="http://schemas.openxmlformats.org/officeDocument/2006/relationships">
+      <w:pPr>
+        <w:keepNext w:val="0"/>
+        <w:keepLines w:val="0"/>
+        <w:pageBreakBefore w:val="0"/>
+        <w:widowControl w:val="0"/>
+        <w:pBdr>
+          <w:top w:space="0" w:sz="0" w:val="nil"/>
+          <w:left w:space="0" w:sz="0" w:val="nil"/>
+          <w:bottom w:space="0" w:sz="0" w:val="nil"/>
+          <w:right w:space="0" w:sz="0" w:val="nil"/>
+          <w:between w:space="0" w:sz="0" w:val="nil"/>
+        </w:pBdr>
+        <w:shd w:fill="auto" w:val="clear"/>
+        <w:spacing w:after="0" w:before="0" w:line="240" w:lineRule="auto"/>
+        <w:ind w:left="0" w:right="565" w:firstLine="0"/>
+        <w:jc w:val="center"/>
+        <w:rPr>
+          <w:rFonts w:ascii="Arial" w:cs="Arial" w:eastAsia="Arial" w:hAnsi="Arial"/>
+          <w:b w:val="1"/>
+          <w:bCs w:val="1"/>
+          <w:i w:val="0"/>
+          <w:iCs w:val="0"/>
+          <w:smallCaps w:val="0"/>
+          <w:strike w:val="0"/>
+          <w:color w:val="000000"/>
+          <w:sz w:val="28"/>
+          <w:szCs w:val="28"/>
+          <w:u w:val="none"/>
+          <w:shd w:fill="auto" w:val="clear"/>
+          <w:vertAlign w:val="baseline"/>
+        </w:rPr>
+      </w:pPr>
+      <w:r>
+        <w:rPr>
+          <w:rtl w:val="0"/>
+        </w:rPr>
+      </w:r>
+    </w:p>
+    <w:p xmlns:w="http://schemas.openxmlformats.org/wordprocessingml/2006/main" xmlns:wp="http://schemas.openxmlformats.org/drawingml/2006/wordprocessingDrawing" xmlns:a="http://schemas.openxmlformats.org/drawingml/2006/main" xmlns:pic="http://schemas.openxmlformats.org/drawingml/2006/picture" xmlns:r="http://schemas.openxmlformats.org/officeDocument/2006/relationships">
+      <w:pPr>
+        <w:keepNext w:val="0"/>
+        <w:keepLines w:val="0"/>
+        <w:pageBreakBefore w:val="0"/>
+        <w:widowControl w:val="0"/>
+        <w:pBdr>
+          <w:top w:space="0" w:sz="0" w:val="nil"/>
+          <w:left w:space="0" w:sz="0" w:val="nil"/>
+          <w:bottom w:space="0" w:sz="0" w:val="nil"/>
+          <w:right w:space="0" w:sz="0" w:val="nil"/>
+          <w:between w:space="0" w:sz="0" w:val="nil"/>
+        </w:pBdr>
+        <w:shd w:fill="auto" w:val="clear"/>
+        <w:spacing w:after="0" w:before="0" w:line="240" w:lineRule="auto"/>
+        <w:ind w:left="0" w:right="565" w:firstLine="0"/>
+        <w:jc w:val="center"/>
+        <w:rPr>
+          <w:rFonts w:ascii="Arial" w:cs="Arial" w:eastAsia="Arial" w:hAnsi="Arial"/>
+          <w:b w:val="1"/>
+          <w:bCs w:val="1"/>
+          <w:i w:val="0"/>
+          <w:iCs w:val="0"/>
+          <w:smallCaps w:val="0"/>
+          <w:strike w:val="0"/>
+          <w:color w:val="000000"/>
+          <w:sz w:val="28"/>
+          <w:szCs w:val="28"/>
+          <w:u w:val="none"/>
+          <w:shd w:fill="auto" w:val="clear"/>
+          <w:vertAlign w:val="baseline"/>
+        </w:rPr>
+      </w:pPr>
+      <w:r>
+        <w:rPr>
+          <w:rtl w:val="0"/>
+        </w:rPr>
+      </w:r>
+    </w:p>
+    <w:p xmlns:w="http://schemas.openxmlformats.org/wordprocessingml/2006/main" xmlns:wp="http://schemas.openxmlformats.org/drawingml/2006/wordprocessingDrawing" xmlns:a="http://schemas.openxmlformats.org/drawingml/2006/main" xmlns:pic="http://schemas.openxmlformats.org/drawingml/2006/picture" xmlns:r="http://schemas.openxmlformats.org/officeDocument/2006/relationships">
+      <w:pPr>
+        <w:ind w:right="-4"/>
+        <w:rPr>
+          <w:rFonts w:ascii="Arial" w:cs="Arial" w:eastAsia="Arial" w:hAnsi="Arial"/>
+        </w:rPr>
+      </w:pPr>
+      <w:r>
+        <w:rPr>
+          <w:rtl w:val="0"/>
+        </w:rPr>
+      </w:r>
+    </w:p>
+    <w:p xmlns:w="http://schemas.openxmlformats.org/wordprocessingml/2006/main" xmlns:wp="http://schemas.openxmlformats.org/drawingml/2006/wordprocessingDrawing" xmlns:a="http://schemas.openxmlformats.org/drawingml/2006/main" xmlns:pic="http://schemas.openxmlformats.org/drawingml/2006/picture" xmlns:r="http://schemas.openxmlformats.org/officeDocument/2006/relationships">
+      <w:pPr>
+        <w:ind w:right="-4"/>
+        <w:rPr>
+          <w:rFonts w:ascii="Arial" w:cs="Arial" w:eastAsia="Arial" w:hAnsi="Arial"/>
+        </w:rPr>
+      </w:pPr>
+      <w:r>
+        <w:rPr>
+          <w:rtl w:val="0"/>
+        </w:rPr>
+      </w:r>
+    </w:p>
+    <w:p xmlns:w="http://schemas.openxmlformats.org/wordprocessingml/2006/main" xmlns:wp="http://schemas.openxmlformats.org/drawingml/2006/wordprocessingDrawing" xmlns:a="http://schemas.openxmlformats.org/drawingml/2006/main" xmlns:pic="http://schemas.openxmlformats.org/drawingml/2006/picture" xmlns:r="http://schemas.openxmlformats.org/officeDocument/2006/relationships">
+      <w:pPr>
+        <w:ind w:right="-4"/>
+        <w:rPr>
+          <w:rFonts w:ascii="Arial" w:cs="Arial" w:eastAsia="Arial" w:hAnsi="Arial"/>
+        </w:rPr>
+      </w:pPr>
+      <w:r>
+        <w:rPr>
+          <w:rtl w:val="0"/>
+        </w:rPr>
+      </w:r>
+    </w:p>
+    <w:p xmlns:w="http://schemas.openxmlformats.org/wordprocessingml/2006/main" xmlns:wp="http://schemas.openxmlformats.org/drawingml/2006/wordprocessingDrawing" xmlns:a="http://schemas.openxmlformats.org/drawingml/2006/main" xmlns:pic="http://schemas.openxmlformats.org/drawingml/2006/picture" xmlns:r="http://schemas.openxmlformats.org/officeDocument/2006/relationships">
+      <w:pPr>
+        <w:ind w:right="-4"/>
+        <w:rPr>
+          <w:rFonts w:ascii="Arial" w:cs="Arial" w:eastAsia="Arial" w:hAnsi="Arial"/>
+          <w:sz w:val="28"/>
+          <w:szCs w:val="28"/>
+        </w:rPr>
+      </w:pPr>
+      <w:r>
+        <w:rPr>
+          <w:rtl w:val="0"/>
+        </w:rPr>
+      </w:r>
+    </w:p>
+    <w:p xmlns:w="http://schemas.openxmlformats.org/wordprocessingml/2006/main" xmlns:wp="http://schemas.openxmlformats.org/drawingml/2006/wordprocessingDrawing" xmlns:a="http://schemas.openxmlformats.org/drawingml/2006/main" xmlns:pic="http://schemas.openxmlformats.org/drawingml/2006/picture" xmlns:r="http://schemas.openxmlformats.org/officeDocument/2006/relationships">
+      <w:pPr>
+        <w:ind w:right="-4"/>
+        <w:jc w:val="center"/>
+        <w:rPr/>
+      </w:pPr>
+      <w:r>
+        <w:rPr>
+          <w:rFonts w:ascii="Arial" w:cs="Arial" w:eastAsia="Arial" w:hAnsi="Arial"/>
+          <w:sz w:val="28"/>
+          <w:szCs w:val="28"/>
+          <w:rtl w:val="0"/>
+        </w:rPr>
+        <w:t xml:space="preserve">2026 Yılı</w:t>
+      </w:r>
+      <w:r>
+        <w:rPr>
+          <w:rtl w:val="0"/>
+        </w:rPr>
+      </w:r>
+    </w:p>
+    <w:p xmlns:w="http://schemas.openxmlformats.org/wordprocessingml/2006/main" xmlns:wp="http://schemas.openxmlformats.org/drawingml/2006/wordprocessingDrawing" xmlns:a="http://schemas.openxmlformats.org/drawingml/2006/main" xmlns:pic="http://schemas.openxmlformats.org/drawingml/2006/picture" xmlns:r="http://schemas.openxmlformats.org/officeDocument/2006/relationships">
+      <w:pPr>
+        <w:ind w:right="-4"/>
+        <w:rPr>
+          <w:rFonts w:ascii="Arial" w:cs="Arial" w:eastAsia="Arial" w:hAnsi="Arial"/>
+          <w:sz w:val="28"/>
+          <w:szCs w:val="28"/>
+        </w:rPr>
+      </w:pPr>
+      <w:r>
+        <w:rPr>
+          <w:rtl w:val="0"/>
+        </w:rPr>
+      </w:r>
+    </w:p>
+    <w:p xmlns:w="http://schemas.openxmlformats.org/wordprocessingml/2006/main" xmlns:wp="http://schemas.openxmlformats.org/drawingml/2006/wordprocessingDrawing" xmlns:a="http://schemas.openxmlformats.org/drawingml/2006/main" xmlns:pic="http://schemas.openxmlformats.org/drawingml/2006/picture" xmlns:r="http://schemas.openxmlformats.org/officeDocument/2006/relationships">
+      <w:pPr>
+        <w:jc w:val="center"/>
+        <w:rPr>
+          <w:rFonts w:ascii="Arial" w:cs="Arial" w:eastAsia="Arial" w:hAnsi="Arial"/>
+          <w:sz w:val="28"/>
+          <w:szCs w:val="28"/>
+        </w:rPr>
+        <w:sectPr>
+          <w:pgSz w:h="16838" w:w="11906" w:orient="portrait"/>
+          <w:pgMar w:bottom="720" w:top="1440" w:left="1239" w:right="1344" w:header="0" w:footer="0"/>
+          <w:pgNumType w:start="1"/>
+        </w:sectPr>
+      </w:pPr>
+      <w:r>
+        <w:rPr>
+          <w:rFonts w:ascii="Arial" w:cs="Arial" w:eastAsia="Arial" w:hAnsi="Arial"/>
+          <w:sz w:val="28"/>
+          <w:szCs w:val="28"/>
+          <w:rtl w:val="0"/>
+        </w:rPr>
+        <w:t xml:space="preserve">1. Dönem Başvurusu</w:t>
+      </w:r>
+    </w:p>
     <ns0:p ns0:rsidR="00000000" ns0:rsidDel="00000000" ns0:rsidP="00000000" ns0:rsidRDefault="00000000" ns0:rsidRPr="00000000" ns1:paraId="5171676F">
       <ns0:pPr>
         <ns0:tabs>

</xml_diff>

<commit_message>
docs: fix 2209-A form formatting and update the AI-use statement
- Remove the broken header shape and use one header title in every section.
- Set Tables 1-3, the JSON sample and the figure/table captions to Arial 9.
- Number 3.1 and 3.2 like the other headings; fix the 3.3 and 1.1 spacing.
- Write the applicant surname in capitals, matching the advisor line.
- Figure 1: centre the "geçerli" label and add the cache-hit arrow into
  the validator.
- Add the Claude Opus 5.5 review session to the AI-use statement.
- Keep the previous docx under "old files/docs/".

Co-Authored-By: Claude Opus 5.5 <noreply@anthropic.com>
</commit_message>
<xml_diff>
--- a/docs/2209-A_Arastirma_Onerisi.docx
+++ b/docs/2209-A_Arastirma_Onerisi.docx
@@ -1158,7 +1158,7 @@
                 <ns0:szCs ns0:val="18"/>
                 <ns0:color ns0:val="000000"/>
               </ns0:rPr>
-              <ns0:t>Başvuru Sahibinin Adı Soyadı: Muhammet Furkan Bilici</ns0:t>
+              <ns0:t>Başvuru Sahibinin Adı Soyadı: Muhammet Furkan BİLİCİ</ns0:t>
             </ns0:r>
           </ns0:p>
         </ns0:tc>
@@ -1878,7 +1878,7 @@
           <ns0:vertAlign ns0:val="baseline"/>
           <ns0:rtl ns0:val="0"/>
         </ns0:rPr>
-        <ns0:t xml:space="preserve"> 1.1. Konunun Önemi ve Araştırma Önerisinin Bilimsel Niteliği</ns0:t>
+        <ns0:t xml:space="preserve">1.1. Konunun Önemi ve Araştırma Önerisinin Bilimsel Niteliği</ns0:t>
       </ns0:r>
     </ns0:p>
     <ns0:p ns0:rsidR="00000000" ns0:rsidDel="00000000" ns0:rsidP="00000000" ns0:rsidRDefault="00000000" ns0:rsidRPr="00000000" ns1:paraId="1DAFFE08">
@@ -3416,8 +3416,8 @@
                 <ns0:b ns0:val="1"/>
                 <ns0:bCs ns0:val="1"/>
                 <ns0:color ns0:val="000000"/>
-                <ns0:sz ns0:val="17"/>
-                <ns0:szCs ns0:val="17"/>
+                <ns0:sz ns0:val="18"/>
+                <ns0:szCs ns0:val="18"/>
               </ns0:rPr>
               <ns0:t xml:space="preserve">Tablo 1.</ns0:t>
             </ns0:r>
@@ -3425,8 +3425,8 @@
               <ns0:rPr>
                 <ns0:rFonts ns0:ascii="Arial" ns0:hAnsi="Arial" ns0:cs="Arial" ns0:eastAsia="Arial"/>
                 <ns0:color ns0:val="000000"/>
-                <ns0:sz ns0:val="17"/>
-                <ns0:szCs ns0:val="17"/>
+                <ns0:sz ns0:val="18"/>
+                <ns0:szCs ns0:val="18"/>
               </ns0:rPr>
               <ns0:t xml:space="preserve"> Deney koşulları.</ns0:t>
             </ns0:r>
@@ -3481,8 +3481,8 @@
                       <ns0:b ns0:val="1"/>
                       <ns0:bCs ns0:val="1"/>
                       <ns0:color ns0:val="000000"/>
-                      <ns0:sz ns0:val="16"/>
-                      <ns0:szCs ns0:val="16"/>
+                      <ns0:sz ns0:val="18"/>
+                      <ns0:szCs ns0:val="18"/>
                     </ns0:rPr>
                     <ns0:t xml:space="preserve">Kod</ns0:t>
                   </ns0:r>
@@ -3507,8 +3507,8 @@
                       <ns0:b ns0:val="1"/>
                       <ns0:bCs ns0:val="1"/>
                       <ns0:color ns0:val="000000"/>
-                      <ns0:sz ns0:val="16"/>
-                      <ns0:szCs ns0:val="16"/>
+                      <ns0:sz ns0:val="18"/>
+                      <ns0:szCs ns0:val="18"/>
                     </ns0:rPr>
                     <ns0:t xml:space="preserve">Koşul</ns0:t>
                   </ns0:r>
@@ -3533,8 +3533,8 @@
                       <ns0:b ns0:val="1"/>
                       <ns0:bCs ns0:val="1"/>
                       <ns0:color ns0:val="000000"/>
-                      <ns0:sz ns0:val="16"/>
-                      <ns0:szCs ns0:val="16"/>
+                      <ns0:sz ns0:val="18"/>
+                      <ns0:szCs ns0:val="18"/>
                     </ns0:rPr>
                     <ns0:t xml:space="preserve">Ne çalışır</ns0:t>
                   </ns0:r>
@@ -3559,8 +3559,8 @@
                       <ns0:b ns0:val="1"/>
                       <ns0:bCs ns0:val="1"/>
                       <ns0:color ns0:val="000000"/>
-                      <ns0:sz ns0:val="16"/>
-                      <ns0:szCs ns0:val="16"/>
+                      <ns0:sz ns0:val="18"/>
+                      <ns0:szCs ns0:val="18"/>
                     </ns0:rPr>
                     <ns0:t xml:space="preserve">Ne çalışmaz</ns0:t>
                   </ns0:r>
@@ -3587,8 +3587,8 @@
                     <ns0:rPr>
                       <ns0:rFonts ns0:ascii="Arial" ns0:hAnsi="Arial" ns0:cs="Arial" ns0:eastAsia="Arial"/>
                       <ns0:color ns0:val="000000"/>
-                      <ns0:sz ns0:val="16"/>
-                      <ns0:szCs ns0:val="16"/>
+                      <ns0:sz ns0:val="18"/>
+                      <ns0:szCs ns0:val="18"/>
                     </ns0:rPr>
                     <ns0:t xml:space="preserve">C0</ns0:t>
                   </ns0:r>
@@ -3610,8 +3610,8 @@
                     <ns0:rPr>
                       <ns0:rFonts ns0:ascii="Arial" ns0:hAnsi="Arial" ns0:cs="Arial" ns0:eastAsia="Arial"/>
                       <ns0:color ns0:val="000000"/>
-                      <ns0:sz ns0:val="16"/>
-                      <ns0:szCs ns0:val="16"/>
+                      <ns0:sz ns0:val="18"/>
+                      <ns0:szCs ns0:val="18"/>
                     </ns0:rPr>
                     <ns0:t xml:space="preserve">Sabit diyalog</ns0:t>
                   </ns0:r>
@@ -3633,8 +3633,8 @@
                     <ns0:rPr>
                       <ns0:rFonts ns0:ascii="Arial" ns0:hAnsi="Arial" ns0:cs="Arial" ns0:eastAsia="Arial"/>
                       <ns0:color ns0:val="000000"/>
-                      <ns0:sz ns0:val="16"/>
-                      <ns0:szCs ns0:val="16"/>
+                      <ns0:sz ns0:val="18"/>
+                      <ns0:szCs ns0:val="18"/>
                     </ns0:rPr>
                     <ns0:t xml:space="preserve">Yazarın yazdığı yanıt ve görev</ns0:t>
                   </ns0:r>
@@ -3656,8 +3656,8 @@
                     <ns0:rPr>
                       <ns0:rFonts ns0:ascii="Arial" ns0:hAnsi="Arial" ns0:cs="Arial" ns0:eastAsia="Arial"/>
                       <ns0:color ns0:val="000000"/>
-                      <ns0:sz ns0:val="16"/>
-                      <ns0:szCs ns0:val="16"/>
+                      <ns0:sz ns0:val="18"/>
+                      <ns0:szCs ns0:val="18"/>
                     </ns0:rPr>
                     <ns0:t xml:space="preserve">Dil modeli, token, önbellek</ns0:t>
                   </ns0:r>
@@ -3684,8 +3684,8 @@
                     <ns0:rPr>
                       <ns0:rFonts ns0:ascii="Arial" ns0:hAnsi="Arial" ns0:cs="Arial" ns0:eastAsia="Arial"/>
                       <ns0:color ns0:val="000000"/>
-                      <ns0:sz ns0:val="16"/>
-                      <ns0:szCs ns0:val="16"/>
+                      <ns0:sz ns0:val="18"/>
+                      <ns0:szCs ns0:val="18"/>
                     </ns0:rPr>
                     <ns0:t xml:space="preserve">C1</ns0:t>
                   </ns0:r>
@@ -3707,8 +3707,8 @@
                     <ns0:rPr>
                       <ns0:rFonts ns0:ascii="Arial" ns0:hAnsi="Arial" ns0:cs="Arial" ns0:eastAsia="Arial"/>
                       <ns0:color ns0:val="000000"/>
-                      <ns0:sz ns0:val="16"/>
-                      <ns0:szCs ns0:val="16"/>
+                      <ns0:sz ns0:val="18"/>
+                      <ns0:szCs ns0:val="18"/>
                     </ns0:rPr>
                     <ns0:t xml:space="preserve">Yalnız dil modeli</ns0:t>
                   </ns0:r>
@@ -3730,8 +3730,8 @@
                     <ns0:rPr>
                       <ns0:rFonts ns0:ascii="Arial" ns0:hAnsi="Arial" ns0:cs="Arial" ns0:eastAsia="Arial"/>
                       <ns0:color ns0:val="000000"/>
-                      <ns0:sz ns0:val="16"/>
-                      <ns0:szCs ns0:val="16"/>
+                      <ns0:sz ns0:val="18"/>
+                      <ns0:szCs ns0:val="18"/>
                     </ns0:rPr>
                     <ns0:t xml:space="preserve">API çağrısı ve JSON ayrıştırma</ns0:t>
                   </ns0:r>
@@ -3753,8 +3753,8 @@
                     <ns0:rPr>
                       <ns0:rFonts ns0:ascii="Arial" ns0:hAnsi="Arial" ns0:cs="Arial" ns0:eastAsia="Arial"/>
                       <ns0:color ns0:val="000000"/>
-                      <ns0:sz ns0:val="16"/>
-                      <ns0:szCs ns0:val="16"/>
+                      <ns0:sz ns0:val="18"/>
+                      <ns0:szCs ns0:val="18"/>
                     </ns0:rPr>
                     <ns0:t xml:space="preserve">Kural doğrulaması, önbellek</ns0:t>
                   </ns0:r>
@@ -3781,8 +3781,8 @@
                     <ns0:rPr>
                       <ns0:rFonts ns0:ascii="Arial" ns0:hAnsi="Arial" ns0:cs="Arial" ns0:eastAsia="Arial"/>
                       <ns0:color ns0:val="000000"/>
-                      <ns0:sz ns0:val="16"/>
-                      <ns0:szCs ns0:val="16"/>
+                      <ns0:sz ns0:val="18"/>
+                      <ns0:szCs ns0:val="18"/>
                     </ns0:rPr>
                     <ns0:t xml:space="preserve">C2</ns0:t>
                   </ns0:r>
@@ -3804,8 +3804,8 @@
                     <ns0:rPr>
                       <ns0:rFonts ns0:ascii="Arial" ns0:hAnsi="Arial" ns0:cs="Arial" ns0:eastAsia="Arial"/>
                       <ns0:color ns0:val="000000"/>
-                      <ns0:sz ns0:val="16"/>
-                      <ns0:szCs ns0:val="16"/>
+                      <ns0:sz ns0:val="18"/>
+                      <ns0:szCs ns0:val="18"/>
                     </ns0:rPr>
                     <ns0:t xml:space="preserve">Dil modeli + doğrulama + önbellek</ns0:t>
                   </ns0:r>
@@ -3827,8 +3827,8 @@
                     <ns0:rPr>
                       <ns0:rFonts ns0:ascii="Arial" ns0:hAnsi="Arial" ns0:cs="Arial" ns0:eastAsia="Arial"/>
                       <ns0:color ns0:val="000000"/>
-                      <ns0:sz ns0:val="16"/>
-                      <ns0:szCs ns0:val="16"/>
+                      <ns0:sz ns0:val="18"/>
+                      <ns0:szCs ns0:val="18"/>
                     </ns0:rPr>
                     <ns0:t xml:space="preserve">Şema, izin, ön koşul, önbellek, yedek diyalog</ns0:t>
                   </ns0:r>
@@ -3850,8 +3850,8 @@
                     <ns0:rPr>
                       <ns0:rFonts ns0:ascii="Arial" ns0:hAnsi="Arial" ns0:cs="Arial" ns0:eastAsia="Arial"/>
                       <ns0:color ns0:val="000000"/>
-                      <ns0:sz ns0:val="16"/>
-                      <ns0:szCs ns0:val="16"/>
+                      <ns0:sz ns0:val="18"/>
+                      <ns0:szCs ns0:val="18"/>
                     </ns0:rPr>
                     <ns0:t xml:space="preserve">—</ns0:t>
                   </ns0:r>
@@ -3940,8 +3940,8 @@
                 <ns0:b ns0:val="1"/>
                 <ns0:bCs ns0:val="1"/>
                 <ns0:color ns0:val="000000"/>
-                <ns0:sz ns0:val="17"/>
-                <ns0:szCs ns0:val="17"/>
+                <ns0:sz ns0:val="18"/>
+                <ns0:szCs ns0:val="18"/>
               </ns0:rPr>
               <ns0:t xml:space="preserve">Şekil 1.</ns0:t>
             </ns0:r>
@@ -3949,8 +3949,8 @@
               <ns0:rPr>
                 <ns0:rFonts ns0:ascii="Arial" ns0:hAnsi="Arial" ns0:cs="Arial" ns0:eastAsia="Arial"/>
                 <ns0:color ns0:val="000000"/>
-                <ns0:sz ns0:val="17"/>
-                <ns0:szCs ns0:val="17"/>
+                <ns0:sz ns0:val="18"/>
+                <ns0:szCs ns0:val="18"/>
               </ns0:rPr>
               <ns0:t xml:space="preserve"> Olaydan oyun eylemine akış. C2’de doğrulayıcı ve önbellek açıktır; C1’de JSON doğrudan yürütücüye gider.</ns0:t>
             </ns0:r>
@@ -4448,8 +4448,8 @@
               <ns0:rPr>
                 <ns0:rFonts ns0:ascii="Consolas" ns0:hAnsi="Consolas" ns0:cs="Consolas" ns0:eastAsia="Consolas"/>
                 <ns0:color ns0:val="000000"/>
-                <ns0:sz ns0:val="16"/>
-                <ns0:szCs ns0:val="16"/>
+                <ns0:sz ns0:val="18"/>
+                <ns0:szCs ns0:val="18"/>
               </ns0:rPr>
               <ns0:t xml:space="preserve">{</ns0:t>
             </ns0:r>
@@ -4466,8 +4466,8 @@
               <ns0:rPr>
                 <ns0:rFonts ns0:ascii="Consolas" ns0:hAnsi="Consolas" ns0:cs="Consolas" ns0:eastAsia="Consolas"/>
                 <ns0:color ns0:val="000000"/>
-                <ns0:sz ns0:val="16"/>
-                <ns0:szCs ns0:val="16"/>
+                <ns0:sz ns0:val="18"/>
+                <ns0:szCs ns0:val="18"/>
               </ns0:rPr>
               <ns0:t xml:space="preserve">  "dialogue": "İlacı nöbetçiye ulaştır.",</ns0:t>
             </ns0:r>
@@ -4484,8 +4484,8 @@
               <ns0:rPr>
                 <ns0:rFonts ns0:ascii="Consolas" ns0:hAnsi="Consolas" ns0:cs="Consolas" ns0:eastAsia="Consolas"/>
                 <ns0:color ns0:val="000000"/>
-                <ns0:sz ns0:val="16"/>
-                <ns0:szCs ns0:val="16"/>
+                <ns0:sz ns0:val="18"/>
+                <ns0:szCs ns0:val="18"/>
               </ns0:rPr>
               <ns0:t xml:space="preserve">  "action": "offer_quest",</ns0:t>
             </ns0:r>
@@ -4502,8 +4502,8 @@
               <ns0:rPr>
                 <ns0:rFonts ns0:ascii="Consolas" ns0:hAnsi="Consolas" ns0:cs="Consolas" ns0:eastAsia="Consolas"/>
                 <ns0:color ns0:val="000000"/>
-                <ns0:sz ns0:val="16"/>
-                <ns0:szCs ns0:val="16"/>
+                <ns0:sz ns0:val="18"/>
+                <ns0:szCs ns0:val="18"/>
               </ns0:rPr>
               <ns0:t xml:space="preserve">  "quest_id": "deliver_medicine",</ns0:t>
             </ns0:r>
@@ -4520,8 +4520,8 @@
               <ns0:rPr>
                 <ns0:rFonts ns0:ascii="Consolas" ns0:hAnsi="Consolas" ns0:cs="Consolas" ns0:eastAsia="Consolas"/>
                 <ns0:color ns0:val="000000"/>
-                <ns0:sz ns0:val="16"/>
-                <ns0:szCs ns0:val="16"/>
+                <ns0:sz ns0:val="18"/>
+                <ns0:szCs ns0:val="18"/>
               </ns0:rPr>
               <ns0:t xml:space="preserve">  "target_id": "village_guard"</ns0:t>
             </ns0:r>
@@ -4538,8 +4538,8 @@
               <ns0:rPr>
                 <ns0:rFonts ns0:ascii="Consolas" ns0:hAnsi="Consolas" ns0:cs="Consolas" ns0:eastAsia="Consolas"/>
                 <ns0:color ns0:val="000000"/>
-                <ns0:sz ns0:val="16"/>
-                <ns0:szCs ns0:val="16"/>
+                <ns0:sz ns0:val="18"/>
+                <ns0:szCs ns0:val="18"/>
               </ns0:rPr>
               <ns0:t xml:space="preserve">}</ns0:t>
             </ns0:r>
@@ -4575,8 +4575,8 @@
                 <ns0:b ns0:val="1"/>
                 <ns0:bCs ns0:val="1"/>
                 <ns0:color ns0:val="000000"/>
-                <ns0:sz ns0:val="17"/>
-                <ns0:szCs ns0:val="17"/>
+                <ns0:sz ns0:val="18"/>
+                <ns0:szCs ns0:val="18"/>
               </ns0:rPr>
               <ns0:t xml:space="preserve">Tablo 2.</ns0:t>
             </ns0:r>
@@ -4584,8 +4584,8 @@
               <ns0:rPr>
                 <ns0:rFonts ns0:ascii="Arial" ns0:hAnsi="Arial" ns0:cs="Arial" ns0:eastAsia="Arial"/>
                 <ns0:color ns0:val="000000"/>
-                <ns0:sz ns0:val="17"/>
-                <ns0:szCs ns0:val="17"/>
+                <ns0:sz ns0:val="18"/>
+                <ns0:szCs ns0:val="18"/>
               </ns0:rPr>
               <ns0:t xml:space="preserve"> Kabul senaryoları.</ns0:t>
             </ns0:r>
@@ -4639,8 +4639,8 @@
                       <ns0:b ns0:val="1"/>
                       <ns0:bCs ns0:val="1"/>
                       <ns0:color ns0:val="000000"/>
-                      <ns0:sz ns0:val="16"/>
-                      <ns0:szCs ns0:val="16"/>
+                      <ns0:sz ns0:val="18"/>
+                      <ns0:szCs ns0:val="18"/>
                     </ns0:rPr>
                     <ns0:t xml:space="preserve">Kod</ns0:t>
                   </ns0:r>
@@ -4665,8 +4665,8 @@
                       <ns0:b ns0:val="1"/>
                       <ns0:bCs ns0:val="1"/>
                       <ns0:color ns0:val="000000"/>
-                      <ns0:sz ns0:val="16"/>
-                      <ns0:szCs ns0:val="16"/>
+                      <ns0:sz ns0:val="18"/>
+                      <ns0:szCs ns0:val="18"/>
                     </ns0:rPr>
                     <ns0:t xml:space="preserve">Kurulum</ns0:t>
                   </ns0:r>
@@ -4691,8 +4691,8 @@
                       <ns0:b ns0:val="1"/>
                       <ns0:bCs ns0:val="1"/>
                       <ns0:color ns0:val="000000"/>
-                      <ns0:sz ns0:val="16"/>
-                      <ns0:szCs ns0:val="16"/>
+                      <ns0:sz ns0:val="18"/>
+                      <ns0:szCs ns0:val="18"/>
                     </ns0:rPr>
                     <ns0:t xml:space="preserve">Geçer sonuç</ns0:t>
                   </ns0:r>
@@ -4719,8 +4719,8 @@
                     <ns0:rPr>
                       <ns0:rFonts ns0:ascii="Arial" ns0:hAnsi="Arial" ns0:cs="Arial" ns0:eastAsia="Arial"/>
                       <ns0:color ns0:val="000000"/>
-                      <ns0:sz ns0:val="16"/>
-                      <ns0:szCs ns0:val="16"/>
+                      <ns0:sz ns0:val="18"/>
+                      <ns0:szCs ns0:val="18"/>
                     </ns0:rPr>
                     <ns0:t xml:space="preserve">S1</ns0:t>
                   </ns0:r>
@@ -4742,8 +4742,8 @@
                     <ns0:rPr>
                       <ns0:rFonts ns0:ascii="Arial" ns0:hAnsi="Arial" ns0:cs="Arial" ns0:eastAsia="Arial"/>
                       <ns0:color ns0:val="000000"/>
-                      <ns0:sz ns0:val="16"/>
-                      <ns0:szCs ns0:val="16"/>
+                      <ns0:sz ns0:val="18"/>
+                      <ns0:szCs ns0:val="18"/>
                     </ns0:rPr>
                     <ns0:t xml:space="preserve">Envanterde ot var</ns0:t>
                   </ns0:r>
@@ -4765,8 +4765,8 @@
                     <ns0:rPr>
                       <ns0:rFonts ns0:ascii="Arial" ns0:hAnsi="Arial" ns0:cs="Arial" ns0:eastAsia="Arial"/>
                       <ns0:color ns0:val="000000"/>
-                      <ns0:sz ns0:val="16"/>
-                      <ns0:szCs ns0:val="16"/>
+                      <ns0:sz ns0:val="18"/>
+                      <ns0:szCs ns0:val="18"/>
                     </ns0:rPr>
                     <ns0:t xml:space="preserve">Teslim görevi açılır, ilerleme bir kez yazılır, diyalog envanterle çelişmez</ns0:t>
                   </ns0:r>
@@ -4793,8 +4793,8 @@
                     <ns0:rPr>
                       <ns0:rFonts ns0:ascii="Arial" ns0:hAnsi="Arial" ns0:cs="Arial" ns0:eastAsia="Arial"/>
                       <ns0:color ns0:val="000000"/>
-                      <ns0:sz ns0:val="16"/>
-                      <ns0:szCs ns0:val="16"/>
+                      <ns0:sz ns0:val="18"/>
+                      <ns0:szCs ns0:val="18"/>
                     </ns0:rPr>
                     <ns0:t xml:space="preserve">S2</ns0:t>
                   </ns0:r>
@@ -4816,8 +4816,8 @@
                     <ns0:rPr>
                       <ns0:rFonts ns0:ascii="Arial" ns0:hAnsi="Arial" ns0:cs="Arial" ns0:eastAsia="Arial"/>
                       <ns0:color ns0:val="000000"/>
-                      <ns0:sz ns0:val="16"/>
-                      <ns0:szCs ns0:val="16"/>
+                      <ns0:sz ns0:val="18"/>
+                      <ns0:szCs ns0:val="18"/>
                     </ns0:rPr>
                     <ns0:t xml:space="preserve">Envanterde ot yok</ns0:t>
                   </ns0:r>
@@ -4839,8 +4839,8 @@
                     <ns0:rPr>
                       <ns0:rFonts ns0:ascii="Arial" ns0:hAnsi="Arial" ns0:cs="Arial" ns0:eastAsia="Arial"/>
                       <ns0:color ns0:val="000000"/>
-                      <ns0:sz ns0:val="16"/>
-                      <ns0:szCs ns0:val="16"/>
+                      <ns0:sz ns0:val="18"/>
+                      <ns0:szCs ns0:val="18"/>
                     </ns0:rPr>
                     <ns0:t xml:space="preserve">Toplama görevi açılır, teslim görevi açılmaz</ns0:t>
                   </ns0:r>
@@ -4867,8 +4867,8 @@
                     <ns0:rPr>
                       <ns0:rFonts ns0:ascii="Arial" ns0:hAnsi="Arial" ns0:cs="Arial" ns0:eastAsia="Arial"/>
                       <ns0:color ns0:val="000000"/>
-                      <ns0:sz ns0:val="16"/>
-                      <ns0:szCs ns0:val="16"/>
+                      <ns0:sz ns0:val="18"/>
+                      <ns0:szCs ns0:val="18"/>
                     </ns0:rPr>
                     <ns0:t xml:space="preserve">S3</ns0:t>
                   </ns0:r>
@@ -4890,8 +4890,8 @@
                     <ns0:rPr>
                       <ns0:rFonts ns0:ascii="Arial" ns0:hAnsi="Arial" ns0:cs="Arial" ns0:eastAsia="Arial"/>
                       <ns0:color ns0:val="000000"/>
-                      <ns0:sz ns0:val="16"/>
-                      <ns0:szCs ns0:val="16"/>
+                      <ns0:sz ns0:val="18"/>
+                      <ns0:szCs ns0:val="18"/>
                     </ns0:rPr>
                     <ns0:t xml:space="preserve">Teslim az önce tamamlandı</ns0:t>
                   </ns0:r>
@@ -4913,8 +4913,8 @@
                     <ns0:rPr>
                       <ns0:rFonts ns0:ascii="Arial" ns0:hAnsi="Arial" ns0:cs="Arial" ns0:eastAsia="Arial"/>
                       <ns0:color ns0:val="000000"/>
-                      <ns0:sz ns0:val="16"/>
-                      <ns0:szCs ns0:val="16"/>
+                      <ns0:sz ns0:val="18"/>
+                      <ns0:szCs ns0:val="18"/>
                     </ns0:rPr>
                     <ns0:t xml:space="preserve">Ödül ikinci kez yazılmaz</ns0:t>
                   </ns0:r>
@@ -4941,8 +4941,8 @@
                     <ns0:rPr>
                       <ns0:rFonts ns0:ascii="Arial" ns0:hAnsi="Arial" ns0:cs="Arial" ns0:eastAsia="Arial"/>
                       <ns0:color ns0:val="000000"/>
-                      <ns0:sz ns0:val="16"/>
-                      <ns0:szCs ns0:val="16"/>
+                      <ns0:sz ns0:val="18"/>
+                      <ns0:szCs ns0:val="18"/>
                     </ns0:rPr>
                     <ns0:t xml:space="preserve">S4</ns0:t>
                   </ns0:r>
@@ -4964,8 +4964,8 @@
                     <ns0:rPr>
                       <ns0:rFonts ns0:ascii="Arial" ns0:hAnsi="Arial" ns0:cs="Arial" ns0:eastAsia="Arial"/>
                       <ns0:color ns0:val="000000"/>
-                      <ns0:sz ns0:val="16"/>
-                      <ns0:szCs ns0:val="16"/>
+                      <ns0:sz ns0:val="18"/>
+                      <ns0:szCs ns0:val="18"/>
                     </ns0:rPr>
                     <ns0:t xml:space="preserve">Bozuk JSON veya izinsiz eylem</ns0:t>
                   </ns0:r>
@@ -4987,8 +4987,8 @@
                     <ns0:rPr>
                       <ns0:rFonts ns0:ascii="Arial" ns0:hAnsi="Arial" ns0:cs="Arial" ns0:eastAsia="Arial"/>
                       <ns0:color ns0:val="000000"/>
-                      <ns0:sz ns0:val="16"/>
-                      <ns0:szCs ns0:val="16"/>
+                      <ns0:sz ns0:val="18"/>
+                      <ns0:szCs ns0:val="18"/>
                     </ns0:rPr>
                     <ns0:t xml:space="preserve">Oyun durumu değişmez, yedek diyalog oynar</ns0:t>
                   </ns0:r>
@@ -5015,8 +5015,8 @@
                     <ns0:rPr>
                       <ns0:rFonts ns0:ascii="Arial" ns0:hAnsi="Arial" ns0:cs="Arial" ns0:eastAsia="Arial"/>
                       <ns0:color ns0:val="000000"/>
-                      <ns0:sz ns0:val="16"/>
-                      <ns0:szCs ns0:val="16"/>
+                      <ns0:sz ns0:val="18"/>
+                      <ns0:szCs ns0:val="18"/>
                     </ns0:rPr>
                     <ns0:t xml:space="preserve">S5</ns0:t>
                   </ns0:r>
@@ -5038,8 +5038,8 @@
                     <ns0:rPr>
                       <ns0:rFonts ns0:ascii="Arial" ns0:hAnsi="Arial" ns0:cs="Arial" ns0:eastAsia="Arial"/>
                       <ns0:color ns0:val="000000"/>
-                      <ns0:sz ns0:val="16"/>
-                      <ns0:szCs ns0:val="16"/>
+                      <ns0:sz ns0:val="18"/>
+                      <ns0:szCs ns0:val="18"/>
                     </ns0:rPr>
                     <ns0:t xml:space="preserve">Zaman aşımı</ns0:t>
                   </ns0:r>
@@ -5061,8 +5061,8 @@
                     <ns0:rPr>
                       <ns0:rFonts ns0:ascii="Arial" ns0:hAnsi="Arial" ns0:cs="Arial" ns0:eastAsia="Arial"/>
                       <ns0:color ns0:val="000000"/>
-                      <ns0:sz ns0:val="16"/>
-                      <ns0:szCs ns0:val="16"/>
+                      <ns0:sz ns0:val="18"/>
+                      <ns0:szCs ns0:val="18"/>
                     </ns0:rPr>
                     <ns0:t xml:space="preserve">Sınırlı yeniden denemeden sonra yazılı yedek yanıt gelir, oyun döngüsü durmaz</ns0:t>
                   </ns0:r>
@@ -5146,8 +5146,8 @@
                 <ns0:b ns0:val="1"/>
                 <ns0:bCs ns0:val="1"/>
                 <ns0:color ns0:val="000000"/>
-                <ns0:sz ns0:val="17"/>
-                <ns0:szCs ns0:val="17"/>
+                <ns0:sz ns0:val="18"/>
+                <ns0:szCs ns0:val="18"/>
               </ns0:rPr>
               <ns0:t xml:space="preserve">Tablo 3.</ns0:t>
             </ns0:r>
@@ -5155,8 +5155,8 @@
               <ns0:rPr>
                 <ns0:rFonts ns0:ascii="Arial" ns0:hAnsi="Arial" ns0:cs="Arial" ns0:eastAsia="Arial"/>
                 <ns0:color ns0:val="000000"/>
-                <ns0:sz ns0:val="17"/>
-                <ns0:szCs ns0:val="17"/>
+                <ns0:sz ns0:val="18"/>
+                <ns0:szCs ns0:val="18"/>
               </ns0:rPr>
               <ns0:t xml:space="preserve"> Tutarlılık kontrol listesi.</ns0:t>
             </ns0:r>
@@ -5211,8 +5211,8 @@
                       <ns0:b ns0:val="1"/>
                       <ns0:bCs ns0:val="1"/>
                       <ns0:color ns0:val="000000"/>
-                      <ns0:sz ns0:val="16"/>
-                      <ns0:szCs ns0:val="16"/>
+                      <ns0:sz ns0:val="18"/>
+                      <ns0:szCs ns0:val="18"/>
                     </ns0:rPr>
                     <ns0:t xml:space="preserve">Sınıf</ns0:t>
                   </ns0:r>
@@ -5237,8 +5237,8 @@
                       <ns0:b ns0:val="1"/>
                       <ns0:bCs ns0:val="1"/>
                       <ns0:color ns0:val="000000"/>
-                      <ns0:sz ns0:val="16"/>
-                      <ns0:szCs ns0:val="16"/>
+                      <ns0:sz ns0:val="18"/>
+                      <ns0:szCs ns0:val="18"/>
                     </ns0:rPr>
                     <ns0:t xml:space="preserve">Kod</ns0:t>
                   </ns0:r>
@@ -5263,8 +5263,8 @@
                       <ns0:b ns0:val="1"/>
                       <ns0:bCs ns0:val="1"/>
                       <ns0:color ns0:val="000000"/>
-                      <ns0:sz ns0:val="16"/>
-                      <ns0:szCs ns0:val="16"/>
+                      <ns0:sz ns0:val="18"/>
+                      <ns0:szCs ns0:val="18"/>
                     </ns0:rPr>
                     <ns0:t xml:space="preserve">Kontrol</ns0:t>
                   </ns0:r>
@@ -5289,8 +5289,8 @@
                       <ns0:b ns0:val="1"/>
                       <ns0:bCs ns0:val="1"/>
                       <ns0:color ns0:val="000000"/>
-                      <ns0:sz ns0:val="16"/>
-                      <ns0:szCs ns0:val="16"/>
+                      <ns0:sz ns0:val="18"/>
+                      <ns0:szCs ns0:val="18"/>
                     </ns0:rPr>
                     <ns0:t xml:space="preserve">Doğrulayıcı denetler mi</ns0:t>
                   </ns0:r>
@@ -5317,8 +5317,8 @@
                     <ns0:rPr>
                       <ns0:rFonts ns0:ascii="Arial" ns0:hAnsi="Arial" ns0:cs="Arial" ns0:eastAsia="Arial"/>
                       <ns0:color ns0:val="000000"/>
-                      <ns0:sz ns0:val="16"/>
-                      <ns0:szCs ns0:val="16"/>
+                      <ns0:sz ns0:val="18"/>
+                      <ns0:szCs ns0:val="18"/>
                     </ns0:rPr>
                     <ns0:t xml:space="preserve">Yapısal</ns0:t>
                   </ns0:r>
@@ -5340,8 +5340,8 @@
                     <ns0:rPr>
                       <ns0:rFonts ns0:ascii="Arial" ns0:hAnsi="Arial" ns0:cs="Arial" ns0:eastAsia="Arial"/>
                       <ns0:color ns0:val="000000"/>
-                      <ns0:sz ns0:val="16"/>
-                      <ns0:szCs ns0:val="16"/>
+                      <ns0:sz ns0:val="18"/>
+                      <ns0:szCs ns0:val="18"/>
                     </ns0:rPr>
                     <ns0:t xml:space="preserve">K1</ns0:t>
                   </ns0:r>
@@ -5363,8 +5363,8 @@
                     <ns0:rPr>
                       <ns0:rFonts ns0:ascii="Arial" ns0:hAnsi="Arial" ns0:cs="Arial" ns0:eastAsia="Arial"/>
                       <ns0:color ns0:val="000000"/>
-                      <ns0:sz ns0:val="16"/>
-                      <ns0:szCs ns0:val="16"/>
+                      <ns0:sz ns0:val="18"/>
+                      <ns0:szCs ns0:val="18"/>
                     </ns0:rPr>
                     <ns0:t xml:space="preserve">Eylem adı izinli listededir</ns0:t>
                   </ns0:r>
@@ -5386,8 +5386,8 @@
                     <ns0:rPr>
                       <ns0:rFonts ns0:ascii="Arial" ns0:hAnsi="Arial" ns0:cs="Arial" ns0:eastAsia="Arial"/>
                       <ns0:color ns0:val="000000"/>
-                      <ns0:sz ns0:val="16"/>
-                      <ns0:szCs ns0:val="16"/>
+                      <ns0:sz ns0:val="18"/>
+                      <ns0:szCs ns0:val="18"/>
                     </ns0:rPr>
                     <ns0:t xml:space="preserve">Evet</ns0:t>
                   </ns0:r>
@@ -5414,8 +5414,8 @@
                     <ns0:rPr>
                       <ns0:rFonts ns0:ascii="Arial" ns0:hAnsi="Arial" ns0:cs="Arial" ns0:eastAsia="Arial"/>
                       <ns0:color ns0:val="000000"/>
-                      <ns0:sz ns0:val="16"/>
-                      <ns0:szCs ns0:val="16"/>
+                      <ns0:sz ns0:val="18"/>
+                      <ns0:szCs ns0:val="18"/>
                     </ns0:rPr>
                     <ns0:t xml:space="preserve">Yapısal</ns0:t>
                   </ns0:r>
@@ -5437,8 +5437,8 @@
                     <ns0:rPr>
                       <ns0:rFonts ns0:ascii="Arial" ns0:hAnsi="Arial" ns0:cs="Arial" ns0:eastAsia="Arial"/>
                       <ns0:color ns0:val="000000"/>
-                      <ns0:sz ns0:val="16"/>
-                      <ns0:szCs ns0:val="16"/>
+                      <ns0:sz ns0:val="18"/>
+                      <ns0:szCs ns0:val="18"/>
                     </ns0:rPr>
                     <ns0:t xml:space="preserve">K2</ns0:t>
                   </ns0:r>
@@ -5460,8 +5460,8 @@
                     <ns0:rPr>
                       <ns0:rFonts ns0:ascii="Arial" ns0:hAnsi="Arial" ns0:cs="Arial" ns0:eastAsia="Arial"/>
                       <ns0:color ns0:val="000000"/>
-                      <ns0:sz ns0:val="16"/>
-                      <ns0:szCs ns0:val="16"/>
+                      <ns0:sz ns0:val="18"/>
+                      <ns0:szCs ns0:val="18"/>
                     </ns0:rPr>
                     <ns0:t xml:space="preserve">Görev kimliği bilinen görevlerdendir</ns0:t>
                   </ns0:r>
@@ -5483,8 +5483,8 @@
                     <ns0:rPr>
                       <ns0:rFonts ns0:ascii="Arial" ns0:hAnsi="Arial" ns0:cs="Arial" ns0:eastAsia="Arial"/>
                       <ns0:color ns0:val="000000"/>
-                      <ns0:sz ns0:val="16"/>
-                      <ns0:szCs ns0:val="16"/>
+                      <ns0:sz ns0:val="18"/>
+                      <ns0:szCs ns0:val="18"/>
                     </ns0:rPr>
                     <ns0:t xml:space="preserve">Evet</ns0:t>
                   </ns0:r>
@@ -5511,8 +5511,8 @@
                     <ns0:rPr>
                       <ns0:rFonts ns0:ascii="Arial" ns0:hAnsi="Arial" ns0:cs="Arial" ns0:eastAsia="Arial"/>
                       <ns0:color ns0:val="000000"/>
-                      <ns0:sz ns0:val="16"/>
-                      <ns0:szCs ns0:val="16"/>
+                      <ns0:sz ns0:val="18"/>
+                      <ns0:szCs ns0:val="18"/>
                     </ns0:rPr>
                     <ns0:t xml:space="preserve">Yapısal</ns0:t>
                   </ns0:r>
@@ -5534,8 +5534,8 @@
                     <ns0:rPr>
                       <ns0:rFonts ns0:ascii="Arial" ns0:hAnsi="Arial" ns0:cs="Arial" ns0:eastAsia="Arial"/>
                       <ns0:color ns0:val="000000"/>
-                      <ns0:sz ns0:val="16"/>
-                      <ns0:szCs ns0:val="16"/>
+                      <ns0:sz ns0:val="18"/>
+                      <ns0:szCs ns0:val="18"/>
                     </ns0:rPr>
                     <ns0:t xml:space="preserve">K3</ns0:t>
                   </ns0:r>
@@ -5557,8 +5557,8 @@
                     <ns0:rPr>
                       <ns0:rFonts ns0:ascii="Arial" ns0:hAnsi="Arial" ns0:cs="Arial" ns0:eastAsia="Arial"/>
                       <ns0:color ns0:val="000000"/>
-                      <ns0:sz ns0:val="16"/>
-                      <ns0:szCs ns0:val="16"/>
+                      <ns0:sz ns0:val="18"/>
+                      <ns0:szCs ns0:val="18"/>
                     </ns0:rPr>
                     <ns0:t xml:space="preserve">Hedef kimliği sahnede vardır</ns0:t>
                   </ns0:r>
@@ -5580,8 +5580,8 @@
                     <ns0:rPr>
                       <ns0:rFonts ns0:ascii="Arial" ns0:hAnsi="Arial" ns0:cs="Arial" ns0:eastAsia="Arial"/>
                       <ns0:color ns0:val="000000"/>
-                      <ns0:sz ns0:val="16"/>
-                      <ns0:szCs ns0:val="16"/>
+                      <ns0:sz ns0:val="18"/>
+                      <ns0:szCs ns0:val="18"/>
                     </ns0:rPr>
                     <ns0:t xml:space="preserve">Evet</ns0:t>
                   </ns0:r>
@@ -5608,8 +5608,8 @@
                     <ns0:rPr>
                       <ns0:rFonts ns0:ascii="Arial" ns0:hAnsi="Arial" ns0:cs="Arial" ns0:eastAsia="Arial"/>
                       <ns0:color ns0:val="000000"/>
-                      <ns0:sz ns0:val="16"/>
-                      <ns0:szCs ns0:val="16"/>
+                      <ns0:sz ns0:val="18"/>
+                      <ns0:szCs ns0:val="18"/>
                     </ns0:rPr>
                     <ns0:t xml:space="preserve">Yapısal</ns0:t>
                   </ns0:r>
@@ -5631,8 +5631,8 @@
                     <ns0:rPr>
                       <ns0:rFonts ns0:ascii="Arial" ns0:hAnsi="Arial" ns0:cs="Arial" ns0:eastAsia="Arial"/>
                       <ns0:color ns0:val="000000"/>
-                      <ns0:sz ns0:val="16"/>
-                      <ns0:szCs ns0:val="16"/>
+                      <ns0:sz ns0:val="18"/>
+                      <ns0:szCs ns0:val="18"/>
                     </ns0:rPr>
                     <ns0:t xml:space="preserve">K4</ns0:t>
                   </ns0:r>
@@ -5654,8 +5654,8 @@
                     <ns0:rPr>
                       <ns0:rFonts ns0:ascii="Arial" ns0:hAnsi="Arial" ns0:cs="Arial" ns0:eastAsia="Arial"/>
                       <ns0:color ns0:val="000000"/>
-                      <ns0:sz ns0:val="16"/>
-                      <ns0:szCs ns0:val="16"/>
+                      <ns0:sz ns0:val="18"/>
+                      <ns0:szCs ns0:val="18"/>
                     </ns0:rPr>
                     <ns0:t xml:space="preserve">Açılan görev envanterle uyumludur (ot varken teslim, yokken toplama)</ns0:t>
                   </ns0:r>
@@ -5677,8 +5677,8 @@
                     <ns0:rPr>
                       <ns0:rFonts ns0:ascii="Arial" ns0:hAnsi="Arial" ns0:cs="Arial" ns0:eastAsia="Arial"/>
                       <ns0:color ns0:val="000000"/>
-                      <ns0:sz ns0:val="16"/>
-                      <ns0:szCs ns0:val="16"/>
+                      <ns0:sz ns0:val="18"/>
+                      <ns0:szCs ns0:val="18"/>
                     </ns0:rPr>
                     <ns0:t xml:space="preserve">Evet</ns0:t>
                   </ns0:r>
@@ -5705,8 +5705,8 @@
                     <ns0:rPr>
                       <ns0:rFonts ns0:ascii="Arial" ns0:hAnsi="Arial" ns0:cs="Arial" ns0:eastAsia="Arial"/>
                       <ns0:color ns0:val="000000"/>
-                      <ns0:sz ns0:val="16"/>
-                      <ns0:szCs ns0:val="16"/>
+                      <ns0:sz ns0:val="18"/>
+                      <ns0:szCs ns0:val="18"/>
                     </ns0:rPr>
                     <ns0:t xml:space="preserve">Anlamsal</ns0:t>
                   </ns0:r>
@@ -5728,8 +5728,8 @@
                     <ns0:rPr>
                       <ns0:rFonts ns0:ascii="Arial" ns0:hAnsi="Arial" ns0:cs="Arial" ns0:eastAsia="Arial"/>
                       <ns0:color ns0:val="000000"/>
-                      <ns0:sz ns0:val="16"/>
-                      <ns0:szCs ns0:val="16"/>
+                      <ns0:sz ns0:val="18"/>
+                      <ns0:szCs ns0:val="18"/>
                     </ns0:rPr>
                     <ns0:t xml:space="preserve">K5</ns0:t>
                   </ns0:r>
@@ -5751,8 +5751,8 @@
                     <ns0:rPr>
                       <ns0:rFonts ns0:ascii="Arial" ns0:hAnsi="Arial" ns0:cs="Arial" ns0:eastAsia="Arial"/>
                       <ns0:color ns0:val="000000"/>
-                      <ns0:sz ns0:val="16"/>
-                      <ns0:szCs ns0:val="16"/>
+                      <ns0:sz ns0:val="18"/>
+                      <ns0:szCs ns0:val="18"/>
                     </ns0:rPr>
                     <ns0:t xml:space="preserve">Diyalogun andığı eşya envanterde vardır veya toplama görevi olarak sunulmuştur</ns0:t>
                   </ns0:r>
@@ -5774,8 +5774,8 @@
                     <ns0:rPr>
                       <ns0:rFonts ns0:ascii="Arial" ns0:hAnsi="Arial" ns0:cs="Arial" ns0:eastAsia="Arial"/>
                       <ns0:color ns0:val="000000"/>
-                      <ns0:sz ns0:val="16"/>
-                      <ns0:szCs ns0:val="16"/>
+                      <ns0:sz ns0:val="18"/>
+                      <ns0:szCs ns0:val="18"/>
                     </ns0:rPr>
                     <ns0:t xml:space="preserve">Hayır</ns0:t>
                   </ns0:r>
@@ -5802,8 +5802,8 @@
                     <ns0:rPr>
                       <ns0:rFonts ns0:ascii="Arial" ns0:hAnsi="Arial" ns0:cs="Arial" ns0:eastAsia="Arial"/>
                       <ns0:color ns0:val="000000"/>
-                      <ns0:sz ns0:val="16"/>
-                      <ns0:szCs ns0:val="16"/>
+                      <ns0:sz ns0:val="18"/>
+                      <ns0:szCs ns0:val="18"/>
                     </ns0:rPr>
                     <ns0:t xml:space="preserve">Anlamsal</ns0:t>
                   </ns0:r>
@@ -5825,8 +5825,8 @@
                     <ns0:rPr>
                       <ns0:rFonts ns0:ascii="Arial" ns0:hAnsi="Arial" ns0:cs="Arial" ns0:eastAsia="Arial"/>
                       <ns0:color ns0:val="000000"/>
-                      <ns0:sz ns0:val="16"/>
-                      <ns0:szCs ns0:val="16"/>
+                      <ns0:sz ns0:val="18"/>
+                      <ns0:szCs ns0:val="18"/>
                     </ns0:rPr>
                     <ns0:t xml:space="preserve">K6</ns0:t>
                   </ns0:r>
@@ -5848,8 +5848,8 @@
                     <ns0:rPr>
                       <ns0:rFonts ns0:ascii="Arial" ns0:hAnsi="Arial" ns0:cs="Arial" ns0:eastAsia="Arial"/>
                       <ns0:color ns0:val="000000"/>
-                      <ns0:sz ns0:val="16"/>
-                      <ns0:szCs ns0:val="16"/>
+                      <ns0:sz ns0:val="18"/>
+                      <ns0:szCs ns0:val="18"/>
                     </ns0:rPr>
                     <ns0:t xml:space="preserve">Diyalog ile eylem alanı birbirini yalanlamaz</ns0:t>
                   </ns0:r>
@@ -5871,8 +5871,8 @@
                     <ns0:rPr>
                       <ns0:rFonts ns0:ascii="Arial" ns0:hAnsi="Arial" ns0:cs="Arial" ns0:eastAsia="Arial"/>
                       <ns0:color ns0:val="000000"/>
-                      <ns0:sz ns0:val="16"/>
-                      <ns0:szCs ns0:val="16"/>
+                      <ns0:sz ns0:val="18"/>
+                      <ns0:szCs ns0:val="18"/>
                     </ns0:rPr>
                     <ns0:t xml:space="preserve">Hayır</ns0:t>
                   </ns0:r>
@@ -5899,8 +5899,8 @@
                     <ns0:rPr>
                       <ns0:rFonts ns0:ascii="Arial" ns0:hAnsi="Arial" ns0:cs="Arial" ns0:eastAsia="Arial"/>
                       <ns0:color ns0:val="000000"/>
-                      <ns0:sz ns0:val="16"/>
-                      <ns0:szCs ns0:val="16"/>
+                      <ns0:sz ns0:val="18"/>
+                      <ns0:szCs ns0:val="18"/>
                     </ns0:rPr>
                     <ns0:t xml:space="preserve">Anlamsal</ns0:t>
                   </ns0:r>
@@ -5922,8 +5922,8 @@
                     <ns0:rPr>
                       <ns0:rFonts ns0:ascii="Arial" ns0:hAnsi="Arial" ns0:cs="Arial" ns0:eastAsia="Arial"/>
                       <ns0:color ns0:val="000000"/>
-                      <ns0:sz ns0:val="16"/>
-                      <ns0:szCs ns0:val="16"/>
+                      <ns0:sz ns0:val="18"/>
+                      <ns0:szCs ns0:val="18"/>
                     </ns0:rPr>
                     <ns0:t xml:space="preserve">K7</ns0:t>
                   </ns0:r>
@@ -5945,8 +5945,8 @@
                     <ns0:rPr>
                       <ns0:rFonts ns0:ascii="Arial" ns0:hAnsi="Arial" ns0:cs="Arial" ns0:eastAsia="Arial"/>
                       <ns0:color ns0:val="000000"/>
-                      <ns0:sz ns0:val="16"/>
-                      <ns0:szCs ns0:val="16"/>
+                      <ns0:sz ns0:val="18"/>
+                      <ns0:szCs ns0:val="18"/>
                     </ns0:rPr>
                     <ns0:t xml:space="preserve">Görev, sunan NPC’nin rolüne uygun hedefe bağlanmıştır (teslim görevi şifacıdan nöbetçiyedir)</ns0:t>
                   </ns0:r>
@@ -5968,8 +5968,8 @@
                     <ns0:rPr>
                       <ns0:rFonts ns0:ascii="Arial" ns0:hAnsi="Arial" ns0:cs="Arial" ns0:eastAsia="Arial"/>
                       <ns0:color ns0:val="000000"/>
-                      <ns0:sz ns0:val="16"/>
-                      <ns0:szCs ns0:val="16"/>
+                      <ns0:sz ns0:val="18"/>
+                      <ns0:szCs ns0:val="18"/>
                     </ns0:rPr>
                     <ns0:t xml:space="preserve">Hayır</ns0:t>
                   </ns0:r>
@@ -6306,8 +6306,8 @@
                 <ns0:b ns0:val="1"/>
                 <ns0:bCs ns0:val="1"/>
                 <ns0:color ns0:val="000000"/>
-                <ns0:sz ns0:val="17"/>
-                <ns0:szCs ns0:val="17"/>
+                <ns0:sz ns0:val="18"/>
+                <ns0:szCs ns0:val="18"/>
               </ns0:rPr>
               <ns0:t xml:space="preserve">Şekil 2.</ns0:t>
             </ns0:r>
@@ -6315,8 +6315,8 @@
               <ns0:rPr>
                 <ns0:rFonts ns0:ascii="Arial" ns0:hAnsi="Arial" ns0:cs="Arial" ns0:eastAsia="Arial"/>
                 <ns0:color ns0:val="000000"/>
-                <ns0:sz ns0:val="17"/>
-                <ns0:szCs ns0:val="17"/>
+                <ns0:sz ns0:val="18"/>
+                <ns0:szCs ns0:val="18"/>
               </ns0:rPr>
               <ns0:t xml:space="preserve"> Ön çalışma: derlenen sözleşme dosyaları (Assets/Scripts) ve doğrulayıcı arayüzü. Görüntü, depodaki kaynak dosyalardan üretilmiş bir kod görünümüdür.</ns0:t>
             </ns0:r>
@@ -8829,7 +8829,7 @@
           <ns0:szCs ns0:val="18"/>
           <ns0:rtl ns0:val="0"/>
         </ns0:rPr>
-        <ns0:t xml:space="preserve">3.3.Araştırma Olanakları</ns0:t>
+        <ns0:t xml:space="preserve">3.3. Araştırma Olanakları</ns0:t>
       </ns0:r>
     </ns0:p>
     <ns0:p ns0:rsidR="00000000" ns0:rsidDel="00000000" ns0:rsidP="00000000" ns0:rsidRDefault="00000000" ns0:rsidRPr="00000000" ns1:paraId="65EC3DFE">
@@ -14764,7 +14764,7 @@
           <ns0:sz ns0:val="18"/>
           <ns0:szCs ns0:val="18"/>
         </ns0:rPr>
-        <ns0:t xml:space="preserve"> Bu önerinin hazırlanmasında iki üretken yapay zekâ aracından yararlanılmıştır: Cursor üzerinden xAI’nin Grok 4.7 modeli, proje tabanının (Unity proje iskeleti ve yazılım sözleşmeleri) ve önerinin ilk yazımı dahil başlangıç belgelerinin hazırlanmasında; Anthropic’in Claude Sonnet 5.5 modeli (Claude Code aracılığıyla) ise 22 Ekim 2026 tarihli sürümde danışman geri bildirimine göre hipotezlerin, yöntemin ve bütçenin yeniden kurulmasında, metnin yazılıp düzenlenmesinde, tablo ve şekillerin hazırlanmasında ve çağrı metinleriyle karşılaştırılmasında kullanılmıştır. Aynı model 30 Ekim 2026 tarihli sürümde Cursor üzerinden, kaynakların DOI ve URL doğrulamasında, 2026 çağrısının başvuru içeriği bilgi notuna uygunluk denetiminde ve metin düzeltmelerinde kullanılmıştır. Kullanım, TÜBİTAK’ın “Destek Süreçlerinde Üretken Yapay Zekânın (ÜYZ) Sorumlu ve Güvenilir Kullanımı Rehberi” çerçevesinde beyan edilmektedir; içeriğin doğruluğundan ve özgünlüğünden proje yürütücüsü ile akademik danışman sorumludur.</ns0:t>
+        <ns0:t xml:space="preserve"> Bu önerinin hazırlanmasında üç üretken yapay zekâ modelinden yararlanılmıştır: Cursor üzerinden xAI’nin Grok 4.7 modeli, proje tabanının (Unity proje iskeleti ve yazılım sözleşmeleri) ve önerinin ilk yazımı dahil başlangıç belgelerinin hazırlanmasında; Anthropic’in Claude Sonnet 5.5 modeli (Claude Code aracılığıyla) ise 22 Ekim 2026 tarihli sürümde danışman geri bildirimine göre hipotezlerin, yöntemin ve bütçenin yeniden kurulmasında, metnin yazılıp düzenlenmesinde, tablo ve şekillerin hazırlanmasında ve çağrı metinleriyle karşılaştırılmasında kullanılmıştır. Aynı model 30 Ekim 2026 tarihli sürümde Cursor üzerinden, kaynakların DOI ve URL doğrulamasında, 2026 çağrısının başvuru içeriği bilgi notuna uygunluk denetiminde ve metin düzeltmelerinde kullanılmıştır. Anthropic’in Claude Opus 5.5 modeli (Claude Code aracılığıyla) de 30 Ekim 2026’da belgenin içerik tutarlılığı, atıf doğruluğu ve biçim açısından gözden geçirilmesinde, biçim düzeltmelerinde (üst bilgi, tablo yazı boyutu ve başlık numaralandırması) ve Şekil 1’e önbellek isabeti okunun eklenmesinde kullanılmıştır. Kullanım, TÜBİTAK’ın “Destek Süreçlerinde Üretken Yapay Zekânın (ÜYZ) Sorumlu ve Güvenilir Kullanımı Rehberi” çerçevesinde beyan edilmektedir; içeriğin doğruluğundan ve özgünlüğünden proje yürütücüsü ile akademik danışman sorumludur.</ns0:t>
       </ns0:r>
     </ns0:p>
     <ns0:p ns1:paraId="1C9BE3A6">
@@ -16357,116 +16357,6 @@
         <w:rtl w:val="0"/>
       </w:rPr>
     </w:r>
-    <w:r>
-      <mc:AlternateContent>
-        <mc:Choice Requires="wps">
-          <w:drawing>
-            <wp:anchor allowOverlap="1" behindDoc="1" distB="0" distT="0" distL="0" distR="0" hidden="0" layoutInCell="1" locked="0" relativeHeight="0" simplePos="0">
-              <wp:simplePos x="0" y="0"/>
-              <wp:positionH relativeFrom="column">
-                <wp:posOffset>-45084</wp:posOffset>
-              </wp:positionH>
-              <wp:positionV relativeFrom="paragraph">
-                <wp:posOffset>66650</wp:posOffset>
-              </wp:positionV>
-              <wp:extent cx="4445" cy="38150"/>
-              <wp:effectExtent b="0" l="0" r="0" t="0"/>
-              <wp:wrapNone/>
-              <wp:docPr id="6" name=""/>
-              <a:graphic>
-                <a:graphicData uri="http://schemas.microsoft.com/office/word/2010/wordprocessingShape">
-                  <wps:wsp>
-                    <wps:cNvSpPr/>
-                    <wps:cNvPr id="3" name="Shape 3"/>
-                    <wps:spPr>
-                      <a:xfrm>
-                        <a:off x="2452680" y="3778020"/>
-                        <a:ext cx="5786640" cy="3960"/>
-                      </a:xfrm>
-                      <a:custGeom>
-                        <a:rect b="b" l="l" r="r" t="t"/>
-                        <a:pathLst>
-                          <a:path extrusionOk="0" h="21600" w="21600">
-                            <a:moveTo>
-                              <a:pt x="0" y="0"/>
-                            </a:moveTo>
-                            <a:lnTo>
-                              <a:pt x="21600" y="21600"/>
-                            </a:lnTo>
-                          </a:path>
-                        </a:pathLst>
-                      </a:custGeom>
-                      <a:noFill/>
-                      <a:ln cap="flat" cmpd="sng" w="38150">
-                        <a:solidFill>
-                          <a:srgbClr val="8DB3E2"/>
-                        </a:solidFill>
-                        <a:prstDash val="solid"/>
-                        <a:round/>
-                        <a:headEnd len="sm" w="sm" type="none"/>
-                        <a:tailEnd len="sm" w="sm" type="none"/>
-                      </a:ln>
-                      <a:effectLst>
-                        <a:outerShdw rotWithShape="0" algn="ctr" dir="2700000" dist="36147">
-                          <a:srgbClr val="3F3151">
-                            <a:alpha val="49803"/>
-                          </a:srgbClr>
-                        </a:outerShdw>
-                      </a:effectLst>
-                    </wps:spPr>
-                    <wps:bodyPr anchorCtr="0" anchor="ctr" bIns="91425" lIns="91425" spcFirstLastPara="1" rIns="91425" wrap="square" tIns="91425">
-                      <a:noAutofit/>
-                    </wps:bodyPr>
-                  </wps:wsp>
-                </a:graphicData>
-              </a:graphic>
-            </wp:anchor>
-          </w:drawing>
-        </mc:Choice>
-        <mc:Fallback>
-          <w:drawing>
-            <wp:anchor allowOverlap="1" behindDoc="1" distB="0" distT="0" distL="0" distR="0" hidden="0" layoutInCell="1" locked="0" relativeHeight="0" simplePos="0">
-              <wp:simplePos x="0" y="0"/>
-              <wp:positionH relativeFrom="column">
-                <wp:posOffset>-45084</wp:posOffset>
-              </wp:positionH>
-              <wp:positionV relativeFrom="paragraph">
-                <wp:posOffset>66650</wp:posOffset>
-              </wp:positionV>
-              <wp:extent cx="4445" cy="38150"/>
-              <wp:effectExtent b="0" l="0" r="0" t="0"/>
-              <wp:wrapNone/>
-              <wp:docPr id="6" name="image11.png"/>
-              <a:graphic>
-                <a:graphicData uri="http://schemas.openxmlformats.org/drawingml/2006/picture">
-                  <pic:pic>
-                    <pic:nvPicPr>
-                      <pic:cNvPr id="0" name="image11.png"/>
-                      <pic:cNvPicPr preferRelativeResize="0"/>
-                    </pic:nvPicPr>
-                    <pic:blipFill>
-                      <a:blip r:embed="rId1"/>
-                      <a:srcRect/>
-                      <a:stretch>
-                        <a:fillRect/>
-                      </a:stretch>
-                    </pic:blipFill>
-                    <pic:spPr>
-                      <a:xfrm>
-                        <a:off x="0" y="0"/>
-                        <a:ext cx="4445" cy="38150"/>
-                      </a:xfrm>
-                      <a:prstGeom prst="rect"/>
-                      <a:ln/>
-                    </pic:spPr>
-                  </pic:pic>
-                </a:graphicData>
-              </a:graphic>
-            </wp:anchor>
-          </w:drawing>
-        </mc:Fallback>
-      </mc:AlternateContent>
-    </w:r>
   </w:p>
 </w:hdr>
 </file>
@@ -16523,7 +16413,7 @@
         <w:vertAlign w:val="baseline"/>
         <w:rtl w:val="0"/>
       </w:rPr>
-      <w:t xml:space="preserve">2209/A ÜNİVERSİTE ÖĞRENCİLERİ ARAŞTIRMA PROJELERİ DESTEĞİ PROGRAMI ARAŞTIRMA ÖNERİSİ FORMU</w:t>
+      <w:t xml:space="preserve">2209-A ÜNİVERSİTE ÖĞRENCİLERİ ARAŞTIRMA PROJELERİ DESTEKLEME PROGRAMI ARAŞTIRMA ÖNERİSİ FORMU</w:t>
     </w:r>
     <w:r>
       <w:rPr>
@@ -16573,116 +16463,6 @@
         <w:rtl w:val="0"/>
       </w:rPr>
     </w:r>
-    <w:r>
-      <mc:AlternateContent>
-        <mc:Choice Requires="wps">
-          <w:drawing>
-            <wp:anchor allowOverlap="1" behindDoc="1" distB="0" distT="0" distL="0" distR="0" hidden="0" layoutInCell="1" locked="0" relativeHeight="0" simplePos="0">
-              <wp:simplePos x="0" y="0"/>
-              <wp:positionH relativeFrom="column">
-                <wp:posOffset>-45084</wp:posOffset>
-              </wp:positionH>
-              <wp:positionV relativeFrom="paragraph">
-                <wp:posOffset>66650</wp:posOffset>
-              </wp:positionV>
-              <wp:extent cx="4445" cy="38150"/>
-              <wp:effectExtent b="0" l="0" r="0" t="0"/>
-              <wp:wrapNone/>
-              <wp:docPr id="5" name=""/>
-              <a:graphic>
-                <a:graphicData uri="http://schemas.microsoft.com/office/word/2010/wordprocessingShape">
-                  <wps:wsp>
-                    <wps:cNvSpPr/>
-                    <wps:cNvPr id="2" name="Shape 2"/>
-                    <wps:spPr>
-                      <a:xfrm>
-                        <a:off x="2452680" y="3778020"/>
-                        <a:ext cx="5786640" cy="3960"/>
-                      </a:xfrm>
-                      <a:custGeom>
-                        <a:rect b="b" l="l" r="r" t="t"/>
-                        <a:pathLst>
-                          <a:path extrusionOk="0" h="21600" w="21600">
-                            <a:moveTo>
-                              <a:pt x="0" y="0"/>
-                            </a:moveTo>
-                            <a:lnTo>
-                              <a:pt x="21600" y="21600"/>
-                            </a:lnTo>
-                          </a:path>
-                        </a:pathLst>
-                      </a:custGeom>
-                      <a:noFill/>
-                      <a:ln cap="flat" cmpd="sng" w="38150">
-                        <a:solidFill>
-                          <a:srgbClr val="8DB3E2"/>
-                        </a:solidFill>
-                        <a:prstDash val="solid"/>
-                        <a:round/>
-                        <a:headEnd len="sm" w="sm" type="none"/>
-                        <a:tailEnd len="sm" w="sm" type="none"/>
-                      </a:ln>
-                      <a:effectLst>
-                        <a:outerShdw rotWithShape="0" algn="ctr" dir="2700000" dist="36147">
-                          <a:srgbClr val="3F3151">
-                            <a:alpha val="49803"/>
-                          </a:srgbClr>
-                        </a:outerShdw>
-                      </a:effectLst>
-                    </wps:spPr>
-                    <wps:bodyPr anchorCtr="0" anchor="ctr" bIns="91425" lIns="91425" spcFirstLastPara="1" rIns="91425" wrap="square" tIns="91425">
-                      <a:noAutofit/>
-                    </wps:bodyPr>
-                  </wps:wsp>
-                </a:graphicData>
-              </a:graphic>
-            </wp:anchor>
-          </w:drawing>
-        </mc:Choice>
-        <mc:Fallback>
-          <w:drawing>
-            <wp:anchor allowOverlap="1" behindDoc="1" distB="0" distT="0" distL="0" distR="0" hidden="0" layoutInCell="1" locked="0" relativeHeight="0" simplePos="0">
-              <wp:simplePos x="0" y="0"/>
-              <wp:positionH relativeFrom="column">
-                <wp:posOffset>-45084</wp:posOffset>
-              </wp:positionH>
-              <wp:positionV relativeFrom="paragraph">
-                <wp:posOffset>66650</wp:posOffset>
-              </wp:positionV>
-              <wp:extent cx="4445" cy="38150"/>
-              <wp:effectExtent b="0" l="0" r="0" t="0"/>
-              <wp:wrapNone/>
-              <wp:docPr id="5" name="image10.png"/>
-              <a:graphic>
-                <a:graphicData uri="http://schemas.openxmlformats.org/drawingml/2006/picture">
-                  <pic:pic>
-                    <pic:nvPicPr>
-                      <pic:cNvPr id="0" name="image10.png"/>
-                      <pic:cNvPicPr preferRelativeResize="0"/>
-                    </pic:nvPicPr>
-                    <pic:blipFill>
-                      <a:blip r:embed="rId1"/>
-                      <a:srcRect/>
-                      <a:stretch>
-                        <a:fillRect/>
-                      </a:stretch>
-                    </pic:blipFill>
-                    <pic:spPr>
-                      <a:xfrm>
-                        <a:off x="0" y="0"/>
-                        <a:ext cx="4445" cy="38150"/>
-                      </a:xfrm>
-                      <a:prstGeom prst="rect"/>
-                      <a:ln/>
-                    </pic:spPr>
-                  </pic:pic>
-                </a:graphicData>
-              </a:graphic>
-            </wp:anchor>
-          </w:drawing>
-        </mc:Fallback>
-      </mc:AlternateContent>
-    </w:r>
   </w:p>
 </w:hdr>
 </file>
@@ -17583,7 +17363,7 @@
     <w:lvl w:ilvl="1">
       <w:start w:val="1"/>
       <w:numFmt w:val="decimal"/>
-      <w:lvlText w:val="%1.%2"/>
+      <w:lvlText w:val="%1.%2."/>
       <w:lvlJc w:val="left"/>
       <w:pPr>
         <w:ind w:left="720" w:hanging="360"/>

</xml_diff>